<commit_message>
Updated Help text and fixed tooltip bug
</commit_message>
<xml_diff>
--- a/docs/Help.docx
+++ b/docs/Help.docx
@@ -58,32 +58,30 @@
         </w:rPr>
         <w:t>Mark J Leece</w:t>
       </w:r>
-      <w:proofErr w:type="gramStart"/>
       <w:r>
         <w:rPr>
           <w:sz w:val="12"/>
           <w:szCs w:val="12"/>
         </w:rPr>
-        <w:t xml:space="preserve">. </w:t>
-      </w:r>
-      <w:proofErr w:type="gramEnd"/>
+        <w:t>. A</w:t>
+      </w:r>
       <w:r>
         <w:rPr>
           <w:sz w:val="12"/>
           <w:szCs w:val="12"/>
         </w:rPr>
-        <w:t>A</w:t>
-      </w:r>
-      <w:r>
-        <w:rPr>
-          <w:sz w:val="12"/>
-          <w:szCs w:val="12"/>
-        </w:rPr>
         <w:t>ll rights reserved</w:t>
       </w:r>
     </w:p>
     <w:sdt>
       <w:sdtPr>
+        <w:rPr>
+          <w:rFonts w:asciiTheme="minorHAnsi" w:eastAsiaTheme="minorEastAsia" w:hAnsiTheme="minorHAnsi" w:cs="Times New Roman"/>
+          <w:color w:val="auto"/>
+          <w:kern w:val="2"/>
+          <w:sz w:val="24"/>
+          <w:szCs w:val="24"/>
+        </w:rPr>
         <w:id w:val="-305165067"/>
         <w:docPartObj>
           <w:docPartGallery w:val="Table of Contents"/>
@@ -92,14 +90,9 @@
       </w:sdtPr>
       <w:sdtEndPr>
         <w:rPr>
-          <w:rFonts w:asciiTheme="minorHAnsi" w:eastAsiaTheme="minorEastAsia" w:hAnsiTheme="minorHAnsi" w:cs="Times New Roman"/>
           <w:b/>
           <w:bCs/>
           <w:noProof/>
-          <w:color w:val="auto"/>
-          <w:kern w:val="2"/>
-          <w:sz w:val="24"/>
-          <w:szCs w:val="24"/>
         </w:rPr>
       </w:sdtEndPr>
       <w:sdtContent>
@@ -132,7 +125,7 @@
           <w:r>
             <w:fldChar w:fldCharType="separate"/>
           </w:r>
-          <w:hyperlink w:anchor="_Toc231893940" w:history="1">
+          <w:hyperlink w:anchor="_Toc231987044" w:history="1">
             <w:r>
               <w:rPr>
                 <w:rStyle w:val="Hyperlink"/>
@@ -159,7 +152,7 @@
                 <w:noProof/>
                 <w:webHidden/>
               </w:rPr>
-              <w:instrText xml:space="preserve"> PAGEREF _Toc231893940 \h </w:instrText>
+              <w:instrText xml:space="preserve"> PAGEREF _Toc231987044 \h </w:instrText>
             </w:r>
             <w:r>
               <w:rPr>
@@ -202,7 +195,7 @@
               <w14:ligatures w14:val="standardContextual"/>
             </w:rPr>
           </w:pPr>
-          <w:hyperlink w:anchor="_Toc231893941" w:history="1">
+          <w:hyperlink w:anchor="_Toc231987045" w:history="1">
             <w:r>
               <w:rPr>
                 <w:rStyle w:val="Hyperlink"/>
@@ -229,7 +222,7 @@
                 <w:noProof/>
                 <w:webHidden/>
               </w:rPr>
-              <w:instrText xml:space="preserve"> PAGEREF _Toc231893941 \h </w:instrText>
+              <w:instrText xml:space="preserve"> PAGEREF _Toc231987045 \h </w:instrText>
             </w:r>
             <w:r>
               <w:rPr>
@@ -272,7 +265,7 @@
               <w14:ligatures w14:val="standardContextual"/>
             </w:rPr>
           </w:pPr>
-          <w:hyperlink w:anchor="_Toc231893942" w:history="1">
+          <w:hyperlink w:anchor="_Toc231987046" w:history="1">
             <w:r>
               <w:rPr>
                 <w:rStyle w:val="Hyperlink"/>
@@ -299,7 +292,7 @@
                 <w:noProof/>
                 <w:webHidden/>
               </w:rPr>
-              <w:instrText xml:space="preserve"> PAGEREF _Toc231893942 \h </w:instrText>
+              <w:instrText xml:space="preserve"> PAGEREF _Toc231987046 \h </w:instrText>
             </w:r>
             <w:r>
               <w:rPr>
@@ -342,7 +335,7 @@
               <w14:ligatures w14:val="standardContextual"/>
             </w:rPr>
           </w:pPr>
-          <w:hyperlink w:anchor="_Toc231893943" w:history="1">
+          <w:hyperlink w:anchor="_Toc231987047" w:history="1">
             <w:r>
               <w:rPr>
                 <w:rStyle w:val="Hyperlink"/>
@@ -369,7 +362,7 @@
                 <w:noProof/>
                 <w:webHidden/>
               </w:rPr>
-              <w:instrText xml:space="preserve"> PAGEREF _Toc231893943 \h </w:instrText>
+              <w:instrText xml:space="preserve"> PAGEREF _Toc231987047 \h </w:instrText>
             </w:r>
             <w:r>
               <w:rPr>
@@ -412,7 +405,7 @@
               <w14:ligatures w14:val="standardContextual"/>
             </w:rPr>
           </w:pPr>
-          <w:hyperlink w:anchor="_Toc231893944" w:history="1">
+          <w:hyperlink w:anchor="_Toc231987048" w:history="1">
             <w:r>
               <w:rPr>
                 <w:rStyle w:val="Hyperlink"/>
@@ -439,7 +432,7 @@
                 <w:noProof/>
                 <w:webHidden/>
               </w:rPr>
-              <w:instrText xml:space="preserve"> PAGEREF _Toc231893944 \h </w:instrText>
+              <w:instrText xml:space="preserve"> PAGEREF _Toc231987048 \h </w:instrText>
             </w:r>
             <w:r>
               <w:rPr>
@@ -482,7 +475,7 @@
               <w14:ligatures w14:val="standardContextual"/>
             </w:rPr>
           </w:pPr>
-          <w:hyperlink w:anchor="_Toc231893945" w:history="1">
+          <w:hyperlink w:anchor="_Toc231987049" w:history="1">
             <w:r>
               <w:rPr>
                 <w:rStyle w:val="Hyperlink"/>
@@ -509,7 +502,7 @@
                 <w:noProof/>
                 <w:webHidden/>
               </w:rPr>
-              <w:instrText xml:space="preserve"> PAGEREF _Toc231893945 \h </w:instrText>
+              <w:instrText xml:space="preserve"> PAGEREF _Toc231987049 \h </w:instrText>
             </w:r>
             <w:r>
               <w:rPr>
@@ -552,7 +545,7 @@
               <w14:ligatures w14:val="standardContextual"/>
             </w:rPr>
           </w:pPr>
-          <w:hyperlink w:anchor="_Toc231893946" w:history="1">
+          <w:hyperlink w:anchor="_Toc231987050" w:history="1">
             <w:r>
               <w:rPr>
                 <w:rStyle w:val="Hyperlink"/>
@@ -579,7 +572,7 @@
                 <w:noProof/>
                 <w:webHidden/>
               </w:rPr>
-              <w:instrText xml:space="preserve"> PAGEREF _Toc231893946 \h </w:instrText>
+              <w:instrText xml:space="preserve"> PAGEREF _Toc231987050 \h </w:instrText>
             </w:r>
             <w:r>
               <w:rPr>
@@ -622,7 +615,7 @@
               <w14:ligatures w14:val="standardContextual"/>
             </w:rPr>
           </w:pPr>
-          <w:hyperlink w:anchor="_Toc231893947" w:history="1">
+          <w:hyperlink w:anchor="_Toc231987051" w:history="1">
             <w:r>
               <w:rPr>
                 <w:rStyle w:val="Hyperlink"/>
@@ -649,7 +642,7 @@
                 <w:noProof/>
                 <w:webHidden/>
               </w:rPr>
-              <w:instrText xml:space="preserve"> PAGEREF _Toc231893947 \h </w:instrText>
+              <w:instrText xml:space="preserve"> PAGEREF _Toc231987051 \h </w:instrText>
             </w:r>
             <w:r>
               <w:rPr>
@@ -692,7 +685,7 @@
               <w14:ligatures w14:val="standardContextual"/>
             </w:rPr>
           </w:pPr>
-          <w:hyperlink w:anchor="_Toc231893948" w:history="1">
+          <w:hyperlink w:anchor="_Toc231987052" w:history="1">
             <w:r>
               <w:rPr>
                 <w:rStyle w:val="Hyperlink"/>
@@ -719,7 +712,7 @@
                 <w:noProof/>
                 <w:webHidden/>
               </w:rPr>
-              <w:instrText xml:space="preserve"> PAGEREF _Toc231893948 \h </w:instrText>
+              <w:instrText xml:space="preserve"> PAGEREF _Toc231987052 \h </w:instrText>
             </w:r>
             <w:r>
               <w:rPr>
@@ -762,7 +755,7 @@
               <w14:ligatures w14:val="standardContextual"/>
             </w:rPr>
           </w:pPr>
-          <w:hyperlink w:anchor="_Toc231893949" w:history="1">
+          <w:hyperlink w:anchor="_Toc231987053" w:history="1">
             <w:r>
               <w:rPr>
                 <w:rStyle w:val="Hyperlink"/>
@@ -789,7 +782,7 @@
                 <w:noProof/>
                 <w:webHidden/>
               </w:rPr>
-              <w:instrText xml:space="preserve"> PAGEREF _Toc231893949 \h </w:instrText>
+              <w:instrText xml:space="preserve"> PAGEREF _Toc231987053 \h </w:instrText>
             </w:r>
             <w:r>
               <w:rPr>
@@ -832,7 +825,7 @@
               <w14:ligatures w14:val="standardContextual"/>
             </w:rPr>
           </w:pPr>
-          <w:hyperlink w:anchor="_Toc231893950" w:history="1">
+          <w:hyperlink w:anchor="_Toc231987054" w:history="1">
             <w:r>
               <w:rPr>
                 <w:rStyle w:val="Hyperlink"/>
@@ -859,7 +852,7 @@
                 <w:noProof/>
                 <w:webHidden/>
               </w:rPr>
-              <w:instrText xml:space="preserve"> PAGEREF _Toc231893950 \h </w:instrText>
+              <w:instrText xml:space="preserve"> PAGEREF _Toc231987054 \h </w:instrText>
             </w:r>
             <w:r>
               <w:rPr>
@@ -902,7 +895,7 @@
               <w14:ligatures w14:val="standardContextual"/>
             </w:rPr>
           </w:pPr>
-          <w:hyperlink w:anchor="_Toc231893951" w:history="1">
+          <w:hyperlink w:anchor="_Toc231987055" w:history="1">
             <w:r>
               <w:rPr>
                 <w:rStyle w:val="Hyperlink"/>
@@ -929,7 +922,7 @@
                 <w:noProof/>
                 <w:webHidden/>
               </w:rPr>
-              <w:instrText xml:space="preserve"> PAGEREF _Toc231893951 \h </w:instrText>
+              <w:instrText xml:space="preserve"> PAGEREF _Toc231987055 \h </w:instrText>
             </w:r>
             <w:r>
               <w:rPr>
@@ -972,7 +965,7 @@
               <w14:ligatures w14:val="standardContextual"/>
             </w:rPr>
           </w:pPr>
-          <w:hyperlink w:anchor="_Toc231893952" w:history="1">
+          <w:hyperlink w:anchor="_Toc231987056" w:history="1">
             <w:r>
               <w:rPr>
                 <w:rStyle w:val="Hyperlink"/>
@@ -999,7 +992,7 @@
                 <w:noProof/>
                 <w:webHidden/>
               </w:rPr>
-              <w:instrText xml:space="preserve"> PAGEREF _Toc231893952 \h </w:instrText>
+              <w:instrText xml:space="preserve"> PAGEREF _Toc231987056 \h </w:instrText>
             </w:r>
             <w:r>
               <w:rPr>
@@ -1042,7 +1035,7 @@
               <w14:ligatures w14:val="standardContextual"/>
             </w:rPr>
           </w:pPr>
-          <w:hyperlink w:anchor="_Toc231893953" w:history="1">
+          <w:hyperlink w:anchor="_Toc231987057" w:history="1">
             <w:r>
               <w:rPr>
                 <w:rStyle w:val="Hyperlink"/>
@@ -1069,7 +1062,7 @@
                 <w:noProof/>
                 <w:webHidden/>
               </w:rPr>
-              <w:instrText xml:space="preserve"> PAGEREF _Toc231893953 \h </w:instrText>
+              <w:instrText xml:space="preserve"> PAGEREF _Toc231987057 \h </w:instrText>
             </w:r>
             <w:r>
               <w:rPr>
@@ -1112,7 +1105,7 @@
               <w14:ligatures w14:val="standardContextual"/>
             </w:rPr>
           </w:pPr>
-          <w:hyperlink w:anchor="_Toc231893954" w:history="1">
+          <w:hyperlink w:anchor="_Toc231987058" w:history="1">
             <w:r>
               <w:rPr>
                 <w:rStyle w:val="Hyperlink"/>
@@ -1139,7 +1132,7 @@
                 <w:noProof/>
                 <w:webHidden/>
               </w:rPr>
-              <w:instrText xml:space="preserve"> PAGEREF _Toc231893954 \h </w:instrText>
+              <w:instrText xml:space="preserve"> PAGEREF _Toc231987058 \h </w:instrText>
             </w:r>
             <w:r>
               <w:rPr>
@@ -1182,7 +1175,7 @@
               <w14:ligatures w14:val="standardContextual"/>
             </w:rPr>
           </w:pPr>
-          <w:hyperlink w:anchor="_Toc231893955" w:history="1">
+          <w:hyperlink w:anchor="_Toc231987059" w:history="1">
             <w:r>
               <w:rPr>
                 <w:rStyle w:val="Hyperlink"/>
@@ -1209,7 +1202,7 @@
                 <w:noProof/>
                 <w:webHidden/>
               </w:rPr>
-              <w:instrText xml:space="preserve"> PAGEREF _Toc231893955 \h </w:instrText>
+              <w:instrText xml:space="preserve"> PAGEREF _Toc231987059 \h </w:instrText>
             </w:r>
             <w:r>
               <w:rPr>
@@ -1252,7 +1245,7 @@
               <w14:ligatures w14:val="standardContextual"/>
             </w:rPr>
           </w:pPr>
-          <w:hyperlink w:anchor="_Toc231893956" w:history="1">
+          <w:hyperlink w:anchor="_Toc231987060" w:history="1">
             <w:r>
               <w:rPr>
                 <w:rStyle w:val="Hyperlink"/>
@@ -1279,7 +1272,7 @@
                 <w:noProof/>
                 <w:webHidden/>
               </w:rPr>
-              <w:instrText xml:space="preserve"> PAGEREF _Toc231893956 \h </w:instrText>
+              <w:instrText xml:space="preserve"> PAGEREF _Toc231987060 \h </w:instrText>
             </w:r>
             <w:r>
               <w:rPr>
@@ -1322,7 +1315,7 @@
               <w14:ligatures w14:val="standardContextual"/>
             </w:rPr>
           </w:pPr>
-          <w:hyperlink w:anchor="_Toc231893957" w:history="1">
+          <w:hyperlink w:anchor="_Toc231987061" w:history="1">
             <w:r>
               <w:rPr>
                 <w:rStyle w:val="Hyperlink"/>
@@ -1349,7 +1342,7 @@
                 <w:noProof/>
                 <w:webHidden/>
               </w:rPr>
-              <w:instrText xml:space="preserve"> PAGEREF _Toc231893957 \h </w:instrText>
+              <w:instrText xml:space="preserve"> PAGEREF _Toc231987061 \h </w:instrText>
             </w:r>
             <w:r>
               <w:rPr>
@@ -1401,7 +1394,7 @@
       <w:pPr>
         <w:pStyle w:val="Heading1"/>
       </w:pPr>
-      <w:bookmarkStart w:id="0" w:name="_Toc231893940"/>
+      <w:bookmarkStart w:id="0" w:name="_Toc231987044"/>
       <w:proofErr w:type="spellStart"/>
       <w:r>
         <w:lastRenderedPageBreak/>
@@ -1469,13 +1462,8 @@
       <w:r>
         <w:t xml:space="preserve"> code is spending most of its time</w:t>
       </w:r>
-      <w:proofErr w:type="gramStart"/>
-      <w:r>
-        <w:t xml:space="preserve">. </w:t>
-      </w:r>
-      <w:proofErr w:type="gramEnd"/>
-      <w:r>
-        <w:t xml:space="preserve">The profiler </w:t>
+      <w:r>
+        <w:t xml:space="preserve">. The profiler </w:t>
       </w:r>
       <w:r>
         <w:t>identifies</w:t>
@@ -1530,7 +1518,13 @@
         <w:br/>
       </w:r>
       <w:r>
-        <w:t>Focusing optimization effects in these area</w:t>
+        <w:t>Focusing optimization eff</w:t>
+      </w:r>
+      <w:r>
+        <w:t>orts</w:t>
+      </w:r>
+      <w:r>
+        <w:t xml:space="preserve"> in these area</w:t>
       </w:r>
       <w:r>
         <w:t>s</w:t>
@@ -1545,27 +1539,17 @@
         <w:t xml:space="preserve"> likely </w:t>
       </w:r>
       <w:r>
-        <w:t xml:space="preserve">deliver the largest </w:t>
-      </w:r>
-      <w:proofErr w:type="gramStart"/>
-      <w:r>
-        <w:t>speed</w:t>
-      </w:r>
-      <w:r>
-        <w:t xml:space="preserve"> up</w:t>
-      </w:r>
-      <w:proofErr w:type="gramEnd"/>
-      <w:r>
-        <w:t xml:space="preserve"> improvements</w:t>
-      </w:r>
-      <w:proofErr w:type="gramStart"/>
-      <w:r>
-        <w:t>.</w:t>
+        <w:t>deliver the largest speed</w:t>
+      </w:r>
+      <w:r>
+        <w:t>up</w:t>
+      </w:r>
+      <w:r>
+        <w:t xml:space="preserve"> improvements.</w:t>
       </w:r>
       <w:r>
         <w:t xml:space="preserve"> </w:t>
       </w:r>
-      <w:proofErr w:type="gramEnd"/>
       <w:r>
         <w:t>And better still, one can re</w:t>
       </w:r>
@@ -1693,15 +1677,7 @@
         <w:t xml:space="preserve"> </w:t>
       </w:r>
       <w:r>
-        <w:t>behaves across iterations can be very useful</w:t>
-      </w:r>
-      <w:proofErr w:type="gramStart"/>
-      <w:r>
-        <w:t xml:space="preserve">. </w:t>
-      </w:r>
-      <w:proofErr w:type="gramEnd"/>
-      <w:r>
-        <w:t xml:space="preserve">The profiler can highlight and report iterations that took </w:t>
+        <w:t xml:space="preserve">behaves across iterations can be very useful. The profiler can highlight and report iterations that took </w:t>
       </w:r>
       <w:r>
         <w:t>longer</w:t>
@@ -1719,13 +1695,8 @@
         <w:t xml:space="preserve"> of a second and can identify cases where the game-loop loses alignment with v-sync</w:t>
       </w:r>
       <w:r>
-        <w:t xml:space="preserve"> (Vertical Sync)</w:t>
-      </w:r>
-      <w:proofErr w:type="gramStart"/>
-      <w:r>
-        <w:t xml:space="preserve">. </w:t>
-      </w:r>
-      <w:proofErr w:type="gramEnd"/>
+        <w:t xml:space="preserve"> (Vertical Sync). </w:t>
+      </w:r>
       <w:r>
         <w:t xml:space="preserve">It can also highlight iterations where writes to </w:t>
       </w:r>
@@ -1775,7 +1746,13 @@
         <w:t xml:space="preserve">screen </w:t>
       </w:r>
       <w:r>
-        <w:t>memory on a CRT</w:t>
+        <w:t xml:space="preserve">memory on </w:t>
+      </w:r>
+      <w:r>
+        <w:t>the</w:t>
+      </w:r>
+      <w:r>
+        <w:t xml:space="preserve"> CRT</w:t>
       </w:r>
       <w:r>
         <w:t xml:space="preserve"> </w:t>
@@ -1798,7 +1775,13 @@
         </w:numPr>
       </w:pPr>
       <w:r>
-        <w:t>What the program’s display frames look like</w:t>
+        <w:t xml:space="preserve">What the </w:t>
+      </w:r>
+      <w:r>
+        <w:t xml:space="preserve">CRT </w:t>
+      </w:r>
+      <w:r>
+        <w:t>display frames look like</w:t>
       </w:r>
       <w:r>
         <w:t xml:space="preserve"> and whether these are as expected.</w:t>
@@ -1817,16 +1800,25 @@
         <w:t xml:space="preserve">Examining individual display frames can be useful in identifying rendering issues </w:t>
       </w:r>
       <w:r>
-        <w:t>and potential bugs, as</w:t>
-      </w:r>
-      <w:r>
-        <w:t xml:space="preserve"> one can </w:t>
+        <w:t>and potential bugs</w:t>
+      </w:r>
+      <w:r>
+        <w:t>. O</w:t>
+      </w:r>
+      <w:r>
+        <w:t xml:space="preserve">ne can </w:t>
       </w:r>
       <w:r>
         <w:t xml:space="preserve">also </w:t>
       </w:r>
       <w:r>
-        <w:t xml:space="preserve">review the actual executed </w:t>
+        <w:t xml:space="preserve">review </w:t>
+      </w:r>
+      <w:r>
+        <w:t>the</w:t>
+      </w:r>
+      <w:r>
+        <w:t xml:space="preserve"> executed </w:t>
       </w:r>
       <w:r>
         <w:t xml:space="preserve">instructions that generated </w:t>
@@ -1888,81 +1880,10 @@
         <w:br/>
       </w:r>
       <w:r>
-        <w:t>Understanding how a routine’s duration varies over time can be useful in some situations</w:t>
-      </w:r>
-      <w:proofErr w:type="gramStart"/>
-      <w:r>
-        <w:t xml:space="preserve">. </w:t>
-      </w:r>
-      <w:proofErr w:type="gramEnd"/>
-      <w:r>
-        <w:t xml:space="preserve">For example, a </w:t>
-      </w:r>
-      <w:proofErr w:type="gramStart"/>
-      <w:r>
-        <w:t>sort</w:t>
-      </w:r>
-      <w:proofErr w:type="gramEnd"/>
-      <w:r>
-        <w:t xml:space="preserve"> routine </w:t>
-      </w:r>
-      <w:r>
-        <w:t xml:space="preserve">that </w:t>
-      </w:r>
-      <w:r>
-        <w:t>sort</w:t>
-      </w:r>
-      <w:r>
-        <w:t>s</w:t>
-      </w:r>
-      <w:r>
-        <w:t xml:space="preserve"> game </w:t>
-      </w:r>
-      <w:r>
-        <w:t xml:space="preserve">sprites </w:t>
-      </w:r>
-      <w:r>
-        <w:t>by their screen Y position</w:t>
-      </w:r>
-      <w:r>
-        <w:t xml:space="preserve"> may </w:t>
-      </w:r>
-      <w:r>
-        <w:t xml:space="preserve">fluctuate differently when called every sixteen frame verses </w:t>
-      </w:r>
-      <w:r>
-        <w:t xml:space="preserve">every </w:t>
-      </w:r>
-      <w:r>
-        <w:t xml:space="preserve">thirty-two </w:t>
-      </w:r>
-      <w:proofErr w:type="gramStart"/>
-      <w:r>
-        <w:t xml:space="preserve">frames. </w:t>
-      </w:r>
-      <w:proofErr w:type="gramEnd"/>
-      <w:r>
-        <w:t>Understand</w:t>
-      </w:r>
-      <w:r>
-        <w:t>ing</w:t>
-      </w:r>
-      <w:r>
-        <w:t xml:space="preserve"> the</w:t>
-      </w:r>
-      <w:r>
-        <w:t>se</w:t>
-      </w:r>
-      <w:r>
-        <w:t xml:space="preserve"> behavioral differences may help </w:t>
-      </w:r>
-      <w:proofErr w:type="gramStart"/>
-      <w:r>
-        <w:t>tune</w:t>
-      </w:r>
-      <w:proofErr w:type="gramEnd"/>
-      <w:r>
-        <w:t xml:space="preserve"> how often the routine is called.</w:t>
+        <w:t>Understanding how a routine’s duration varies over time can be useful in some situations.</w:t>
+      </w:r>
+      <w:r>
+        <w:t xml:space="preserve"> </w:t>
       </w:r>
     </w:p>
     <w:p>
@@ -1970,7 +1891,7 @@
         <w:pStyle w:val="Heading1"/>
       </w:pPr>
       <w:bookmarkStart w:id="1" w:name="_Toc231889080"/>
-      <w:bookmarkStart w:id="2" w:name="_Toc231893941"/>
+      <w:bookmarkStart w:id="2" w:name="_Toc231987045"/>
       <w:r>
         <w:t>Getting started</w:t>
       </w:r>
@@ -2033,56 +1954,51 @@
         <w:t>x</w:t>
       </w:r>
       <w:r>
-        <w:t>)</w:t>
-      </w:r>
-      <w:proofErr w:type="gramStart"/>
-      <w:r>
+        <w:t>).</w:t>
+      </w:r>
+      <w:r>
+        <w:t xml:space="preserve"> </w:t>
+      </w:r>
+      <w:r>
+        <w:t xml:space="preserve">Some sample </w:t>
+      </w:r>
+      <w:r>
+        <w:rPr>
+          <w:b/>
+          <w:bCs/>
+        </w:rPr>
         <w:t>.</w:t>
       </w:r>
       <w:r>
-        <w:t xml:space="preserve"> </w:t>
-      </w:r>
-      <w:proofErr w:type="gramEnd"/>
-      <w:r>
-        <w:t xml:space="preserve">Some sample </w:t>
-      </w:r>
-      <w:r>
-        <w:rPr>
-          <w:b/>
-          <w:bCs/>
-        </w:rPr>
+        <w:rPr>
+          <w:b/>
+          <w:bCs/>
+        </w:rPr>
+        <w:t>p</w:t>
+      </w:r>
+      <w:r>
+        <w:rPr>
+          <w:b/>
+          <w:bCs/>
+        </w:rPr>
+        <w:t>erf</w:t>
+      </w:r>
+      <w:r>
+        <w:t xml:space="preserve"> files can be found in the </w:t>
+      </w:r>
+      <w:r>
+        <w:rPr>
+          <w:b/>
+          <w:bCs/>
+        </w:rPr>
+        <w:t>samples</w:t>
+      </w:r>
+      <w:r>
+        <w:t xml:space="preserve"> folder</w:t>
+      </w:r>
+      <w:r>
         <w:t>.</w:t>
       </w:r>
-      <w:r>
-        <w:rPr>
-          <w:b/>
-          <w:bCs/>
-        </w:rPr>
-        <w:t>p</w:t>
-      </w:r>
-      <w:r>
-        <w:rPr>
-          <w:b/>
-          <w:bCs/>
-        </w:rPr>
-        <w:t>erf</w:t>
-      </w:r>
-      <w:r>
-        <w:t xml:space="preserve"> files can be found in the </w:t>
-      </w:r>
-      <w:r>
-        <w:rPr>
-          <w:b/>
-          <w:bCs/>
-        </w:rPr>
-        <w:t>samples</w:t>
-      </w:r>
-      <w:r>
-        <w:t xml:space="preserve"> folder</w:t>
-      </w:r>
-      <w:r>
-        <w:t>.</w:t>
-      </w:r>
     </w:p>
     <w:p>
       <w:r>
@@ -2094,7 +2010,7 @@
         <w:pStyle w:val="Heading2"/>
       </w:pPr>
       <w:bookmarkStart w:id="3" w:name="_Toc231889081"/>
-      <w:bookmarkStart w:id="4" w:name="_Toc231893942"/>
+      <w:bookmarkStart w:id="4" w:name="_Toc231987046"/>
       <w:r>
         <w:lastRenderedPageBreak/>
         <w:t>The t</w:t>
@@ -2160,16 +2076,14 @@
       <w:r>
         <w:t>actions</w:t>
       </w:r>
-      <w:proofErr w:type="gramStart"/>
       <w:r>
         <w:t>.</w:t>
       </w:r>
       <w:r>
         <w:t xml:space="preserve"> </w:t>
       </w:r>
-      <w:proofErr w:type="gramEnd"/>
-      <w:r>
-        <w:t>We’ll explore these actions in more detail below.</w:t>
+      <w:r>
+        <w:t>We’ll explore these in more detail below.</w:t>
       </w:r>
     </w:p>
     <w:p>
@@ -2177,7 +2091,7 @@
         <w:pStyle w:val="Heading2"/>
       </w:pPr>
       <w:bookmarkStart w:id="5" w:name="_Toc231889082"/>
-      <w:bookmarkStart w:id="6" w:name="_Toc231893943"/>
+      <w:bookmarkStart w:id="6" w:name="_Toc231987047"/>
       <w:r>
         <w:t>The timeline</w:t>
       </w:r>
@@ -2262,16 +2176,11 @@
         <w:t xml:space="preserve">a </w:t>
       </w:r>
       <w:r>
-        <w:t>blue bar</w:t>
-      </w:r>
-      <w:proofErr w:type="gramStart"/>
-      <w:r>
-        <w:t>.</w:t>
+        <w:t>blue bar.</w:t>
       </w:r>
       <w:r>
         <w:t xml:space="preserve"> </w:t>
       </w:r>
-      <w:proofErr w:type="gramEnd"/>
       <w:r>
         <w:t>This can be changed by dragging the end handles o</w:t>
       </w:r>
@@ -2332,30 +2241,35 @@
       <w:r>
         <w:t>button</w:t>
       </w:r>
-      <w:proofErr w:type="gramStart"/>
       <w:r>
         <w:t xml:space="preserve">. </w:t>
       </w:r>
-      <w:proofErr w:type="gramEnd"/>
       <w:r>
         <w:t>The</w:t>
       </w:r>
       <w:r>
-        <w:t xml:space="preserve"> display frames are drawn underneath</w:t>
-      </w:r>
-      <w:proofErr w:type="gramStart"/>
-      <w:r>
-        <w:t xml:space="preserve">. </w:t>
-      </w:r>
-      <w:proofErr w:type="gramEnd"/>
-      <w:r>
-        <w:t xml:space="preserve">Toolbar buttons allow you to zoom in and out, </w:t>
-      </w:r>
-      <w:r>
-        <w:t>rescale the timeline to fit the selection, or tile the display frames</w:t>
-      </w:r>
-      <w:r>
-        <w:t xml:space="preserve"> across the window.</w:t>
+        <w:t xml:space="preserve"> display frames are drawn underneath. Toolbar buttons allow you to zoom in and out, </w:t>
+      </w:r>
+      <w:r>
+        <w:t xml:space="preserve">rescale the timeline to fit the </w:t>
+      </w:r>
+      <w:r>
+        <w:t>selected time range</w:t>
+      </w:r>
+      <w:r>
+        <w:t>, tile the display frames</w:t>
+      </w:r>
+      <w:r>
+        <w:t xml:space="preserve"> across the window</w:t>
+      </w:r>
+      <w:r>
+        <w:t xml:space="preserve">, </w:t>
+      </w:r>
+      <w:r>
+        <w:t>or</w:t>
+      </w:r>
+      <w:r>
+        <w:t xml:space="preserve"> reset the selected time range and zoom.</w:t>
       </w:r>
     </w:p>
     <w:p>
@@ -2363,7 +2277,7 @@
         <w:pStyle w:val="Heading2"/>
       </w:pPr>
       <w:bookmarkStart w:id="7" w:name="_Toc231889083"/>
-      <w:bookmarkStart w:id="8" w:name="_Toc231893944"/>
+      <w:bookmarkStart w:id="8" w:name="_Toc231987048"/>
       <w:r>
         <w:t>The tabs…</w:t>
       </w:r>
@@ -2429,28 +2343,20 @@
         <w:t>The tabs</w:t>
       </w:r>
       <w:r>
-        <w:t xml:space="preserve"> provide different profiler views, allowing one to look at different aspects of the program</w:t>
-      </w:r>
-      <w:proofErr w:type="gramStart"/>
-      <w:r>
-        <w:t>.</w:t>
+        <w:t xml:space="preserve"> provide different profiler views, allowing one to look at different aspects of the program.</w:t>
+      </w:r>
+      <w:r>
+        <w:t xml:space="preserve"> We’ll look at </w:t>
+      </w:r>
+      <w:r>
+        <w:t>each ta</w:t>
+      </w:r>
+      <w:r>
+        <w:t>b</w:t>
       </w:r>
       <w:r>
         <w:t xml:space="preserve"> </w:t>
       </w:r>
-      <w:proofErr w:type="gramEnd"/>
-      <w:r>
-        <w:t xml:space="preserve">We’ll look at </w:t>
-      </w:r>
-      <w:r>
-        <w:t>each ta</w:t>
-      </w:r>
-      <w:r>
-        <w:t>b</w:t>
-      </w:r>
-      <w:r>
-        <w:t xml:space="preserve"> </w:t>
-      </w:r>
       <w:r>
         <w:t>in more detail later, but for n</w:t>
       </w:r>
@@ -2463,7 +2369,7 @@
         <w:pStyle w:val="Heading3"/>
       </w:pPr>
       <w:bookmarkStart w:id="9" w:name="_Toc231889084"/>
-      <w:bookmarkStart w:id="10" w:name="_Toc231893945"/>
+      <w:bookmarkStart w:id="10" w:name="_Toc231987049"/>
       <w:r>
         <w:t xml:space="preserve">Common </w:t>
       </w:r>
@@ -2559,16 +2465,20 @@
             <w:r>
               <w:t xml:space="preserve"> itself</w:t>
             </w:r>
-            <w:proofErr w:type="gramStart"/>
             <w:r>
               <w:t>.</w:t>
             </w:r>
             <w:r>
               <w:t xml:space="preserve"> </w:t>
             </w:r>
-            <w:proofErr w:type="gramEnd"/>
-            <w:r>
-              <w:t>Excludes cycles spent in other routines and interrupt code.</w:t>
+            <w:r>
+              <w:t xml:space="preserve">Excludes cycles spent in other routines </w:t>
+            </w:r>
+            <w:r>
+              <w:t>or</w:t>
+            </w:r>
+            <w:r>
+              <w:t xml:space="preserve"> interrupt code.</w:t>
             </w:r>
           </w:p>
         </w:tc>
@@ -2598,7 +2508,7 @@
           </w:p>
           <w:p>
             <w:r>
-              <w:t>Excludes the cycles spent executing interrupt code during the execution of the routine.</w:t>
+              <w:t>Excludes cycles spent executing interrupt code during the execution of the routine.</w:t>
             </w:r>
           </w:p>
           <w:p>
@@ -2667,18 +2577,21 @@
               <w:t>umber of cycles spent executing instructions within the routine, or any routines it invokes directly or indirectly, from JSR’s, tail-calls, and/or fall-throughs</w:t>
             </w:r>
             <w:r>
-              <w:t xml:space="preserve">, plus the </w:t>
-            </w:r>
-            <w:r>
-              <w:t xml:space="preserve">cycles spent executing </w:t>
+              <w:t xml:space="preserve">, plus </w:t>
+            </w:r>
+            <w:r>
+              <w:t>cycles spent executing interrupt code</w:t>
+            </w:r>
+            <w:r>
+              <w:t xml:space="preserve"> during the execution </w:t>
             </w:r>
             <w:proofErr w:type="gramStart"/>
             <w:r>
-              <w:t>interrupt</w:t>
+              <w:t>f the</w:t>
             </w:r>
             <w:proofErr w:type="gramEnd"/>
             <w:r>
-              <w:t xml:space="preserve"> code.</w:t>
+              <w:t xml:space="preserve"> routine.</w:t>
             </w:r>
           </w:p>
           <w:p>
@@ -2723,6 +2636,9 @@
             <w:r>
               <w:t>invoked</w:t>
             </w:r>
+            <w:r>
+              <w:t>.</w:t>
+            </w:r>
           </w:p>
         </w:tc>
       </w:tr>
@@ -2753,15 +2669,7 @@
               <w:t>tail call</w:t>
             </w:r>
             <w:r>
-              <w:t xml:space="preserve"> is a JMP or branch instruction that jumps to another routine</w:t>
-            </w:r>
-            <w:proofErr w:type="gramStart"/>
-            <w:r>
-              <w:t xml:space="preserve">. </w:t>
-            </w:r>
-            <w:proofErr w:type="gramEnd"/>
-            <w:r>
-              <w:t xml:space="preserve">For a JMP, it’s equivalent to a </w:t>
+              <w:t xml:space="preserve"> is a JMP or branch instruction that jumps to another routine. For a JMP, it’s equivalent to a </w:t>
             </w:r>
             <w:r>
               <w:rPr>
@@ -2801,13 +2709,8 @@
             <w:r>
               <w:t>uses less cycles and code bytes</w:t>
             </w:r>
-            <w:proofErr w:type="gramStart"/>
-            <w:r>
-              <w:t xml:space="preserve">. </w:t>
-            </w:r>
-            <w:proofErr w:type="gramEnd"/>
-            <w:r>
-              <w:t xml:space="preserve">For a branch it’s an optimized way to perform conditional </w:t>
+            <w:r>
+              <w:t xml:space="preserve">. For a branch it’s an optimized way to perform conditional </w:t>
             </w:r>
             <w:r>
               <w:rPr>
@@ -2833,14 +2736,7 @@
               <w:t>: RTS</w:t>
             </w:r>
             <w:r>
-              <w:rPr>
-                <w:b/>
-                <w:bCs/>
-              </w:rPr>
-              <w:t xml:space="preserve"> </w:t>
-            </w:r>
-            <w:r>
-              <w:t>code.</w:t>
+              <w:t>.</w:t>
             </w:r>
           </w:p>
         </w:tc>
@@ -2886,7 +2782,7 @@
         <w:pStyle w:val="Heading2"/>
       </w:pPr>
       <w:bookmarkStart w:id="11" w:name="_Toc231889085"/>
-      <w:bookmarkStart w:id="12" w:name="_Toc231893946"/>
+      <w:bookmarkStart w:id="12" w:name="_Toc231987050"/>
       <w:r>
         <w:t>The code</w:t>
       </w:r>
@@ -2950,16 +2846,11 @@
     </w:p>
     <w:p>
       <w:r>
-        <w:t>The code panel shows the executed instructions of the currently selected routine</w:t>
-      </w:r>
-      <w:proofErr w:type="gramStart"/>
-      <w:r>
-        <w:t>.</w:t>
+        <w:t>The code panel shows the executed instructions of the currently selected routine.</w:t>
       </w:r>
       <w:r>
         <w:t xml:space="preserve"> </w:t>
       </w:r>
-      <w:proofErr w:type="gramEnd"/>
       <w:r>
         <w:t>We’ll give more details on this later</w:t>
       </w:r>
@@ -2972,7 +2863,7 @@
         <w:pStyle w:val="Heading2"/>
       </w:pPr>
       <w:bookmarkStart w:id="13" w:name="_Toc231889086"/>
-      <w:bookmarkStart w:id="14" w:name="_Toc231893947"/>
+      <w:bookmarkStart w:id="14" w:name="_Toc231987051"/>
       <w:r>
         <w:t>Labels…</w:t>
       </w:r>
@@ -2987,15 +2878,7 @@
         <w:t xml:space="preserve">the </w:t>
       </w:r>
       <w:r>
-        <w:t>code</w:t>
-      </w:r>
-      <w:proofErr w:type="gramStart"/>
-      <w:r>
-        <w:t xml:space="preserve">. </w:t>
-      </w:r>
-      <w:proofErr w:type="gramEnd"/>
-      <w:r>
-        <w:t>Without them, one just sees plain addresses.</w:t>
+        <w:t>code. Without them, one just sees plain addresses.</w:t>
       </w:r>
     </w:p>
     <w:p>
@@ -3054,7 +2937,10 @@
         <w:t xml:space="preserve">which </w:t>
       </w:r>
       <w:r>
-        <w:t xml:space="preserve">shown by clicking on the toolbar </w:t>
+        <w:t xml:space="preserve">is </w:t>
+      </w:r>
+      <w:r>
+        <w:t xml:space="preserve">shown by clicking on the </w:t>
       </w:r>
       <w:r>
         <w:rPr>
@@ -3064,7 +2950,13 @@
         <w:t>Labels</w:t>
       </w:r>
       <w:r>
-        <w:t xml:space="preserve"> button.</w:t>
+        <w:t xml:space="preserve"> </w:t>
+      </w:r>
+      <w:r>
+        <w:t xml:space="preserve">toolbar </w:t>
+      </w:r>
+      <w:r>
+        <w:t>button.</w:t>
       </w:r>
     </w:p>
     <w:p>
@@ -3135,6 +3027,7 @@
     </w:p>
     <w:p>
       <w:r>
+        <w:lastRenderedPageBreak/>
         <w:t xml:space="preserve">If you are working on multiple </w:t>
       </w:r>
       <w:r>
@@ -3158,30 +3051,137 @@
       <w:r>
         <w:t xml:space="preserve">choose which ones you would like </w:t>
       </w:r>
-      <w:proofErr w:type="gramStart"/>
+      <w:r>
+        <w:t xml:space="preserve">to be </w:t>
+      </w:r>
       <w:r>
         <w:t>enable</w:t>
       </w:r>
       <w:r>
         <w:t>d</w:t>
       </w:r>
-      <w:proofErr w:type="gramEnd"/>
       <w:r>
         <w:t xml:space="preserve"> or </w:t>
       </w:r>
       <w:r>
-        <w:t>active</w:t>
-      </w:r>
-      <w:proofErr w:type="gramStart"/>
+        <w:t>active.</w:t>
+      </w:r>
+      <w:r>
+        <w:t xml:space="preserve"> The list of imported label files persists across application session</w:t>
+      </w:r>
+      <w:r>
+        <w:t>s</w:t>
+      </w:r>
       <w:r>
         <w:t>.</w:t>
       </w:r>
+    </w:p>
+    <w:p>
+      <w:r>
+        <w:t xml:space="preserve">Labels can be imported from label files created using </w:t>
+      </w:r>
+      <w:r>
+        <w:rPr>
+          <w:b/>
+          <w:bCs/>
+        </w:rPr>
+        <w:t>BeebAsm.exe</w:t>
+      </w:r>
       <w:r>
         <w:t xml:space="preserve"> </w:t>
       </w:r>
-      <w:proofErr w:type="gramEnd"/>
-      <w:r>
-        <w:t>The list of imported label files persists across application session</w:t>
+      <w:r>
+        <w:rPr>
+          <w:b/>
+          <w:bCs/>
+        </w:rPr>
+        <w:t>-labels</w:t>
+      </w:r>
+      <w:r>
+        <w:t xml:space="preserve"> </w:t>
+      </w:r>
+      <w:r>
+        <w:rPr>
+          <w:b/>
+          <w:bCs/>
+        </w:rPr>
+        <w:t>&lt;file&gt;</w:t>
+      </w:r>
+      <w:r>
+        <w:t xml:space="preserve"> command-line option, or </w:t>
+      </w:r>
+      <w:r>
+        <w:t xml:space="preserve">from </w:t>
+      </w:r>
+      <w:r>
+        <w:t xml:space="preserve">assembler listing files created </w:t>
+      </w:r>
+      <w:r>
+        <w:t xml:space="preserve">by </w:t>
+      </w:r>
+      <w:r>
+        <w:rPr>
+          <w:b/>
+          <w:bCs/>
+        </w:rPr>
+        <w:t>BeebAsm</w:t>
+      </w:r>
+      <w:r>
+        <w:t xml:space="preserve">, </w:t>
+      </w:r>
+      <w:r>
+        <w:rPr>
+          <w:b/>
+          <w:bCs/>
+        </w:rPr>
+        <w:t>Baron</w:t>
+      </w:r>
+      <w:r>
+        <w:t xml:space="preserve">, and </w:t>
+      </w:r>
+      <w:r>
+        <w:rPr>
+          <w:b/>
+          <w:bCs/>
+        </w:rPr>
+        <w:t>Acme</w:t>
+      </w:r>
+      <w:r>
+        <w:t>.</w:t>
+      </w:r>
+    </w:p>
+    <w:p>
+      <w:r>
+        <w:t xml:space="preserve">See </w:t>
+      </w:r>
+      <w:r>
+        <w:rPr>
+          <w:b/>
+          <w:bCs/>
+        </w:rPr>
+        <w:t>docs/BeebPerf.doc</w:t>
+      </w:r>
+      <w:r>
+        <w:t xml:space="preserve"> to learn how to </w:t>
+      </w:r>
+      <w:r>
+        <w:t>embed</w:t>
+      </w:r>
+      <w:r>
+        <w:t xml:space="preserve"> labels in recorded</w:t>
+      </w:r>
+      <w:r>
+        <w:t xml:space="preserve"> </w:t>
+      </w:r>
+      <w:r>
+        <w:rPr>
+          <w:b/>
+          <w:bCs/>
+        </w:rPr>
+        <w:t>.perf</w:t>
+      </w:r>
+      <w:r>
+        <w:t xml:space="preserve"> file</w:t>
       </w:r>
       <w:r>
         <w:t>s</w:t>
@@ -3192,145 +3192,30 @@
     </w:p>
     <w:p>
       <w:r>
-        <w:lastRenderedPageBreak/>
-        <w:t xml:space="preserve">Labels can be imported from label files created using </w:t>
-      </w:r>
-      <w:r>
-        <w:rPr>
-          <w:b/>
-          <w:bCs/>
-        </w:rPr>
-        <w:t>BeebAsm.exe</w:t>
-      </w:r>
-      <w:r>
-        <w:t xml:space="preserve"> </w:t>
-      </w:r>
-      <w:r>
-        <w:rPr>
-          <w:b/>
-          <w:bCs/>
-        </w:rPr>
-        <w:t>-labels</w:t>
-      </w:r>
-      <w:r>
-        <w:t xml:space="preserve"> </w:t>
-      </w:r>
-      <w:r>
-        <w:rPr>
-          <w:b/>
-          <w:bCs/>
-        </w:rPr>
-        <w:t>&lt;file&gt;</w:t>
-      </w:r>
-      <w:r>
-        <w:t xml:space="preserve"> command-line option, or </w:t>
-      </w:r>
-      <w:r>
-        <w:t xml:space="preserve">from </w:t>
-      </w:r>
-      <w:r>
-        <w:t xml:space="preserve">assembler listing files created </w:t>
-      </w:r>
-      <w:r>
-        <w:t xml:space="preserve">with </w:t>
-      </w:r>
-      <w:r>
-        <w:rPr>
-          <w:b/>
-          <w:bCs/>
-        </w:rPr>
-        <w:t>BeebAsm</w:t>
-      </w:r>
-      <w:r>
-        <w:t xml:space="preserve">, </w:t>
-      </w:r>
-      <w:r>
-        <w:rPr>
-          <w:b/>
-          <w:bCs/>
-        </w:rPr>
-        <w:t>Baron</w:t>
-      </w:r>
-      <w:r>
-        <w:t xml:space="preserve">, and </w:t>
-      </w:r>
-      <w:r>
-        <w:rPr>
-          <w:b/>
-          <w:bCs/>
-        </w:rPr>
-        <w:t>Acme</w:t>
+        <w:t xml:space="preserve">Note that if an address has multiple labels associated with it, the </w:t>
+      </w:r>
+      <w:r>
+        <w:t xml:space="preserve">expected </w:t>
+      </w:r>
+      <w:r>
+        <w:t xml:space="preserve">label may </w:t>
+      </w:r>
+      <w:r>
+        <w:t xml:space="preserve">not </w:t>
+      </w:r>
+      <w:r>
+        <w:t>be shown</w:t>
       </w:r>
       <w:r>
         <w:t>.</w:t>
       </w:r>
     </w:p>
     <w:p>
-      <w:r>
-        <w:t xml:space="preserve">See </w:t>
-      </w:r>
-      <w:r>
-        <w:rPr>
-          <w:b/>
-          <w:bCs/>
-        </w:rPr>
-        <w:t>docs/BeebPerf.doc</w:t>
-      </w:r>
-      <w:r>
-        <w:t xml:space="preserve"> to learn how to </w:t>
-      </w:r>
-      <w:r>
-        <w:t>embed</w:t>
-      </w:r>
-      <w:r>
-        <w:t xml:space="preserve"> labels in recorded</w:t>
-      </w:r>
-      <w:r>
-        <w:t xml:space="preserve"> </w:t>
-      </w:r>
-      <w:r>
-        <w:rPr>
-          <w:b/>
-          <w:bCs/>
-        </w:rPr>
-        <w:t>.perf</w:t>
-      </w:r>
-      <w:r>
-        <w:t xml:space="preserve"> file</w:t>
-      </w:r>
-      <w:r>
-        <w:t>s</w:t>
-      </w:r>
-      <w:r>
-        <w:t>.</w:t>
-      </w:r>
-    </w:p>
-    <w:p>
-      <w:r>
-        <w:t xml:space="preserve">Note that if an address has multiple labels associated with it, the </w:t>
-      </w:r>
-      <w:r>
-        <w:t xml:space="preserve">expected </w:t>
-      </w:r>
-      <w:r>
-        <w:t xml:space="preserve">label may </w:t>
-      </w:r>
-      <w:r>
-        <w:t xml:space="preserve">not </w:t>
-      </w:r>
-      <w:r>
-        <w:t>be shown</w:t>
-      </w:r>
-      <w:r>
-        <w:t>.</w:t>
-      </w:r>
-    </w:p>
-    <w:p>
       <w:pPr>
         <w:pStyle w:val="Heading1"/>
       </w:pPr>
       <w:bookmarkStart w:id="15" w:name="_Toc231889087"/>
-      <w:bookmarkStart w:id="16" w:name="_Toc231893948"/>
+      <w:bookmarkStart w:id="16" w:name="_Toc231987052"/>
       <w:r>
         <w:t>Understanding</w:t>
       </w:r>
@@ -3345,7 +3230,7 @@
         <w:pStyle w:val="Heading2"/>
       </w:pPr>
       <w:bookmarkStart w:id="17" w:name="_Toc231889088"/>
-      <w:bookmarkStart w:id="18" w:name="_Toc231893949"/>
+      <w:bookmarkStart w:id="18" w:name="_Toc231987053"/>
       <w:r>
         <w:t xml:space="preserve">Where </w:t>
       </w:r>
@@ -3372,15 +3257,7 @@
         <w:t>s</w:t>
       </w:r>
       <w:r>
-        <w:t>… the first thing to do is set the analysis time range so we’re analyzing the right code</w:t>
-      </w:r>
-      <w:proofErr w:type="gramStart"/>
-      <w:r>
-        <w:t xml:space="preserve">. </w:t>
-      </w:r>
-      <w:proofErr w:type="gramEnd"/>
-      <w:r>
-        <w:t xml:space="preserve">For example, if you want to analyze where the code is spending its time during game play, make sure the time range </w:t>
+        <w:t xml:space="preserve">… the first thing to do is set the analysis time range so we’re analyzing the right code. For example, if you want to analyze where the code is spending its time during game play, make sure the time range </w:t>
       </w:r>
       <w:r>
         <w:t>covers game play, and not something else.</w:t>
@@ -3544,24 +3421,42 @@
           <w:rFonts w:ascii="Aptos" w:hAnsi="Aptos"/>
           <w:color w:val="000000"/>
         </w:rPr>
-        <w:t xml:space="preserve"> </w:t>
-      </w:r>
-      <w:proofErr w:type="gramStart"/>
+        <w:t xml:space="preserve"> etc.</w:t>
+      </w:r>
       <w:r>
         <w:rPr>
           <w:rFonts w:ascii="Aptos" w:hAnsi="Aptos"/>
           <w:color w:val="000000"/>
         </w:rPr>
-        <w:t>etc.</w:t>
-      </w:r>
-      <w:r>
+        <w:t xml:space="preserve"> </w:t>
+      </w:r>
+    </w:p>
+    <w:p>
+      <w:pPr>
         <w:rPr>
           <w:rFonts w:ascii="Aptos" w:hAnsi="Aptos"/>
           <w:color w:val="000000"/>
         </w:rPr>
+      </w:pPr>
+      <w:r>
+        <w:t xml:space="preserve">The call tree shows all the routine’s call paths, sorted by </w:t>
+      </w:r>
+      <w:r>
+        <w:rPr>
+          <w:b/>
+          <w:bCs/>
+        </w:rPr>
+        <w:t>Total CPU</w:t>
+      </w:r>
+      <w:r>
         <w:t xml:space="preserve"> </w:t>
       </w:r>
-      <w:proofErr w:type="gramEnd"/>
+      <w:r>
+        <w:t xml:space="preserve">cycle </w:t>
+      </w:r>
+      <w:r>
+        <w:t xml:space="preserve">counts. The top-level nodes represent the program and interrupt entry points. Each node in the tree shows metrics for the context in which it was invoked. </w:t>
+      </w:r>
       <w:r>
         <w:rPr>
           <w:rFonts w:ascii="Aptos" w:hAnsi="Aptos"/>
@@ -3624,42 +3519,7 @@
           <w:rFonts w:ascii="Aptos" w:hAnsi="Aptos"/>
           <w:color w:val="000000"/>
         </w:rPr>
-        <w:t xml:space="preserve">Make sure you scroll down </w:t>
-      </w:r>
-      <w:r>
-        <w:rPr>
-          <w:rFonts w:ascii="Aptos" w:hAnsi="Aptos"/>
-          <w:color w:val="000000"/>
-        </w:rPr>
-        <w:t xml:space="preserve">the list </w:t>
-      </w:r>
-      <w:r>
-        <w:rPr>
-          <w:rFonts w:ascii="Aptos" w:hAnsi="Aptos"/>
-          <w:color w:val="000000"/>
-        </w:rPr>
-        <w:t>as some hot paths may not be visible.</w:t>
-      </w:r>
-    </w:p>
-    <w:p>
-      <w:r>
-        <w:t>The call tree shows all the routine’s call paths, sorted by Total CPU cycles</w:t>
-      </w:r>
-      <w:proofErr w:type="gramStart"/>
-      <w:r>
-        <w:t xml:space="preserve">. </w:t>
-      </w:r>
-      <w:proofErr w:type="gramEnd"/>
-      <w:r>
-        <w:t>The top-level nodes represent the program and interrupt entry points</w:t>
-      </w:r>
-      <w:proofErr w:type="gramStart"/>
-      <w:r>
-        <w:t xml:space="preserve">. </w:t>
-      </w:r>
-      <w:proofErr w:type="gramEnd"/>
-      <w:r>
-        <w:t>Each node in the tree shows metrics for the context in which it was invoked.</w:t>
+        <w:t>Make sure you scroll down as some hot paths may not be visible.</w:t>
       </w:r>
     </w:p>
     <w:p>
@@ -3669,23 +3529,7 @@
     </w:p>
     <w:p>
       <w:r>
-        <w:t>There are two ways to think about optimizing routines in the hot paths</w:t>
-      </w:r>
-      <w:proofErr w:type="gramStart"/>
-      <w:r>
-        <w:t xml:space="preserve">. </w:t>
-      </w:r>
-      <w:proofErr w:type="gramEnd"/>
-      <w:r>
-        <w:t>Firstly, do routines in the hot path need to be called as often as they are</w:t>
-      </w:r>
-      <w:proofErr w:type="gramStart"/>
-      <w:r>
-        <w:t xml:space="preserve">? </w:t>
-      </w:r>
-      <w:proofErr w:type="gramEnd"/>
-      <w:r>
-        <w:t>And secondly, are there ways to optimize the routines themselves?</w:t>
+        <w:t>There are two ways to think about optimizing routines in the hot paths. Firstly, do routines in the hot path need to be called as often as they are? And secondly, are there ways to optimize the routines themselves?</w:t>
       </w:r>
     </w:p>
     <w:p>
@@ -3803,15 +3647,29 @@
         <w:t xml:space="preserve"> which s</w:t>
       </w:r>
       <w:r>
-        <w:t>hows the routines in the program, sorted by their Self-CPU counts</w:t>
-      </w:r>
-      <w:proofErr w:type="gramStart"/>
-      <w:r>
-        <w:t xml:space="preserve">. </w:t>
-      </w:r>
-      <w:proofErr w:type="gramEnd"/>
-      <w:r>
-        <w:t>A flame icon is displayed against the ‘hot’ one, those with the highest Self-CPU counts.</w:t>
+        <w:t xml:space="preserve">hows the routines in the program, sorted by their </w:t>
+      </w:r>
+      <w:r>
+        <w:rPr>
+          <w:b/>
+          <w:bCs/>
+        </w:rPr>
+        <w:t>Self-CPU</w:t>
+      </w:r>
+      <w:r>
+        <w:t xml:space="preserve"> </w:t>
+      </w:r>
+      <w:r>
+        <w:t xml:space="preserve">cycle </w:t>
+      </w:r>
+      <w:r>
+        <w:t>counts. A flame icon is displayed against the ‘hot’ one</w:t>
+      </w:r>
+      <w:r>
+        <w:t>s</w:t>
+      </w:r>
+      <w:r>
+        <w:t>, those with the highest Self-CPU counts.</w:t>
       </w:r>
     </w:p>
     <w:p>
@@ -3826,15 +3684,13 @@
     </w:p>
     <w:p>
       <w:r>
-        <w:t>The focus of this view is about the amount of time code executed just within the routines themselves</w:t>
-      </w:r>
-      <w:proofErr w:type="gramStart"/>
-      <w:r>
-        <w:t xml:space="preserve">. </w:t>
-      </w:r>
-      <w:proofErr w:type="gramEnd"/>
-      <w:r>
-        <w:t>Focusing efforts on optimizing the code in the Hot Routine is simpler, and will lead to good performance improvements, but might miss some opportunities which are specific to the context in which the routine is invoked.</w:t>
+        <w:t>The focus of this view is about the amount of time code executed just within the routines themselves. Focusing efforts on optimizing the code in the Hot Routine</w:t>
+      </w:r>
+      <w:r>
+        <w:t>s</w:t>
+      </w:r>
+      <w:r>
+        <w:t xml:space="preserve"> is simpler, and will lead to good performance improvements, but might miss some opportunities which are specific to the context in which the routine is invoked.</w:t>
       </w:r>
     </w:p>
     <w:p>
@@ -3950,15 +3806,7 @@
         <w:t xml:space="preserve">visualization of where time is being spent, and </w:t>
       </w:r>
       <w:r>
-        <w:t>where the bottlenecks are</w:t>
-      </w:r>
-      <w:proofErr w:type="gramStart"/>
-      <w:r>
-        <w:t xml:space="preserve">. </w:t>
-      </w:r>
-      <w:proofErr w:type="gramEnd"/>
-      <w:r>
-        <w:t xml:space="preserve">It is also useful in </w:t>
+        <w:t xml:space="preserve">where the bottlenecks are. It is also useful in </w:t>
       </w:r>
       <w:r>
         <w:t xml:space="preserve">highlighting </w:t>
@@ -3980,15 +3828,7 @@
         </w:rPr>
       </w:pPr>
       <w:r>
-        <w:t>Clicking on a routine makes it the selected routine</w:t>
-      </w:r>
-      <w:proofErr w:type="gramStart"/>
-      <w:r>
-        <w:t xml:space="preserve">. </w:t>
-      </w:r>
-      <w:proofErr w:type="gramEnd"/>
-      <w:r>
-        <w:t>Clicking in white space clears the selection.</w:t>
+        <w:t>Clicking on a routine makes it the selected routine. Clicking in white space clears the selection.</w:t>
       </w:r>
     </w:p>
     <w:p>
@@ -3996,7 +3836,7 @@
         <w:pStyle w:val="Heading2"/>
       </w:pPr>
       <w:bookmarkStart w:id="19" w:name="_Toc231889089"/>
-      <w:bookmarkStart w:id="20" w:name="_Toc231893950"/>
+      <w:bookmarkStart w:id="20" w:name="_Toc231987054"/>
       <w:r>
         <w:t>W</w:t>
       </w:r>
@@ -4082,7 +3922,7 @@
     </w:p>
     <w:p>
       <w:r>
-        <w:t>The memory tab lists the highest to lowest accessed memory addresses in the application.  The memory can optionally be filtered to just zero-page addresses.</w:t>
+        <w:t>The memory tab lists the highest to lowest accessed memory addresses in the application. The memory can optionally be filtered to just zero-page addresses.</w:t>
       </w:r>
     </w:p>
     <w:p>
@@ -4100,32 +3940,52 @@
     </w:p>
     <w:p>
       <w:r>
-        <w:t>Inspecting the highest accessed memory addresses is a useful exercise as it may reveal that certain addresses are accessed far more frequently than expected, indicating a potential bug</w:t>
+        <w:t>Inspecting the highest accessed memory addresses is a useful exercise as it may reveal that certain addresses are accessed far more frequently than expected, indicating a potential bug. Inspection may also reveal that one or more of the accesses are not in zero</w:t>
+      </w:r>
+      <w:r>
+        <w:t>-</w:t>
+      </w:r>
+      <w:r>
+        <w:t>page, providing an optimization opportunity.</w:t>
+      </w:r>
+    </w:p>
+    <w:p>
+      <w:r>
+        <w:t xml:space="preserve">An </w:t>
+      </w:r>
+      <w:r>
+        <w:t>i</w:t>
+      </w:r>
+      <w:r>
+        <w:t>nstruction that use</w:t>
+      </w:r>
+      <w:r>
+        <w:t>s</w:t>
+      </w:r>
+      <w:r>
+        <w:t xml:space="preserve"> zero-page addressing uses less CPU cycles and code space than the same instruction </w:t>
+      </w:r>
+      <w:r>
+        <w:t xml:space="preserve">does </w:t>
+      </w:r>
+      <w:r>
+        <w:t xml:space="preserve">using </w:t>
       </w:r>
       <w:proofErr w:type="gramStart"/>
       <w:r>
-        <w:t xml:space="preserve">. </w:t>
+        <w:t>non zero</w:t>
       </w:r>
       <w:proofErr w:type="gramEnd"/>
       <w:r>
-        <w:t>Inspection may also reveal that one or more of the accesses are not in zero page, providing an optimization opportunity.</w:t>
-      </w:r>
-    </w:p>
-    <w:p>
-      <w:r>
-        <w:t xml:space="preserve">An </w:t>
-      </w:r>
-      <w:r>
-        <w:t>i</w:t>
-      </w:r>
-      <w:r>
-        <w:t>nstruction that use</w:t>
-      </w:r>
-      <w:r>
-        <w:t>s</w:t>
-      </w:r>
-      <w:r>
-        <w:t xml:space="preserve"> zero-page addressing uses less CPU cycles and code space than the same instruction using </w:t>
+        <w:t>-page addressing modes.</w:t>
+      </w:r>
+    </w:p>
+    <w:p>
+      <w:pPr>
+        <w:pStyle w:val="Callout"/>
+      </w:pPr>
+      <w:r>
+        <w:t xml:space="preserve">Look for opportunities where frequent </w:t>
       </w:r>
       <w:proofErr w:type="gramStart"/>
       <w:r>
@@ -4133,23 +3993,13 @@
       </w:r>
       <w:proofErr w:type="gramEnd"/>
       <w:r>
-        <w:t>-page addressing modes.</w:t>
-      </w:r>
-    </w:p>
-    <w:p>
-      <w:pPr>
-        <w:pStyle w:val="Callout"/>
-      </w:pPr>
-      <w:r>
-        <w:t xml:space="preserve">Look for opportunities where frequent </w:t>
-      </w:r>
-      <w:proofErr w:type="gramStart"/>
-      <w:r>
-        <w:t>non zero</w:t>
-      </w:r>
-      <w:proofErr w:type="gramEnd"/>
-      <w:r>
-        <w:t>-page memory accesses are changed to zero-page accesses.</w:t>
+        <w:t xml:space="preserve">-page memory accesses </w:t>
+      </w:r>
+      <w:r>
+        <w:t xml:space="preserve">can be </w:t>
+      </w:r>
+      <w:r>
+        <w:t>changed to zero-page accesses.</w:t>
       </w:r>
     </w:p>
     <w:p>
@@ -4162,26 +4012,30 @@
         </w:rPr>
       </w:pPr>
       <w:r>
-        <w:t>Selecting an address populates the panel on the right with all the routines which read or write to the selected address, with their respective read and write counts</w:t>
-      </w:r>
-      <w:proofErr w:type="gramStart"/>
+        <w:t>Selecting an address populates the panel on the right with all the routines which read or write to the selected address, with their respective read and write counts.</w:t>
+      </w:r>
+      <w:r>
+        <w:t xml:space="preserve"> </w:t>
+      </w:r>
+      <w:r>
+        <w:t xml:space="preserve">Selecting a routine from the list selects the routine in the code panel, in which the read and write counts are also </w:t>
+      </w:r>
+      <w:r>
+        <w:t xml:space="preserve">shown </w:t>
+      </w:r>
+      <w:r>
+        <w:t>against individual instructions</w:t>
+      </w:r>
       <w:r>
         <w:t>.</w:t>
       </w:r>
-      <w:r>
-        <w:t xml:space="preserve"> </w:t>
-      </w:r>
-      <w:proofErr w:type="gramEnd"/>
-      <w:r>
-        <w:t>Selecting a routine from the list selects the routine in the code panel, in which the read and write counts are also shown.</w:t>
-      </w:r>
     </w:p>
     <w:p>
       <w:pPr>
         <w:pStyle w:val="Heading2"/>
       </w:pPr>
       <w:bookmarkStart w:id="21" w:name="_Toc231889090"/>
-      <w:bookmarkStart w:id="22" w:name="_Toc231893951"/>
+      <w:bookmarkStart w:id="22" w:name="_Toc231987055"/>
       <w:r>
         <w:t>How is the game-loop behaving?</w:t>
       </w:r>
@@ -4282,11 +4136,9 @@
       <w:r>
         <w:t xml:space="preserve"> allows the creation of user definable metrics which allow one to gain </w:t>
       </w:r>
-      <w:proofErr w:type="gramStart"/>
-      <w:r>
-        <w:t>insights</w:t>
-      </w:r>
-      <w:proofErr w:type="gramEnd"/>
+      <w:r>
+        <w:t>insight</w:t>
+      </w:r>
       <w:r>
         <w:t xml:space="preserve"> into how specific routines, </w:t>
       </w:r>
@@ -4419,7 +4271,17 @@
     </w:p>
     <w:p>
       <w:r>
-        <w:t xml:space="preserve">The start address is set to just after the </w:t>
+        <w:t xml:space="preserve">The </w:t>
+      </w:r>
+      <w:r>
+        <w:rPr>
+          <w:b/>
+          <w:bCs/>
+        </w:rPr>
+        <w:t>start address</w:t>
+      </w:r>
+      <w:r>
+        <w:t xml:space="preserve"> is set to just after the </w:t>
       </w:r>
       <w:r>
         <w:t xml:space="preserve">game’s </w:t>
@@ -4436,12 +4298,32 @@
         <w:t xml:space="preserve">is signaled) </w:t>
       </w:r>
       <w:r>
-        <w:t>and the end address is set to the end of the game loop, when all processing has completed.</w:t>
-      </w:r>
-    </w:p>
-    <w:p>
-      <w:r>
-        <w:t>The threshold is set to 1/50</w:t>
+        <w:t xml:space="preserve">and the </w:t>
+      </w:r>
+      <w:r>
+        <w:rPr>
+          <w:b/>
+          <w:bCs/>
+        </w:rPr>
+        <w:t>end address</w:t>
+      </w:r>
+      <w:r>
+        <w:t xml:space="preserve"> is set to the end of the game loop, when all processing has completed.</w:t>
+      </w:r>
+    </w:p>
+    <w:p>
+      <w:r>
+        <w:t xml:space="preserve">The </w:t>
+      </w:r>
+      <w:r>
+        <w:rPr>
+          <w:b/>
+          <w:bCs/>
+        </w:rPr>
+        <w:t>threshold</w:t>
+      </w:r>
+      <w:r>
+        <w:t xml:space="preserve"> is set to 1/50</w:t>
       </w:r>
       <w:r>
         <w:rPr>
@@ -4460,15 +4342,7 @@
         <w:t>Perform display analysis</w:t>
       </w:r>
       <w:r>
-        <w:t xml:space="preserve"> checkbox is also checked</w:t>
-      </w:r>
-      <w:proofErr w:type="gramStart"/>
-      <w:r>
-        <w:t xml:space="preserve">. </w:t>
-      </w:r>
-      <w:proofErr w:type="gramEnd"/>
-      <w:r>
-        <w:t>Checking this box is useful for identifying potential v-sync alignment and display tearing issues.</w:t>
+        <w:t xml:space="preserve"> checkbox is also checked. Checking this box is useful for identifying potential v-sync alignment and display tearing issues.</w:t>
       </w:r>
     </w:p>
     <w:p>
@@ -4490,18 +4364,13 @@
       <w:r>
         <w:t>loop iteration to start sometime after v-sync occurred.</w:t>
       </w:r>
-    </w:p>
-    <w:p>
-      <w:r>
-        <w:t>Display tearing occurs when screen memory writes occur after the CRTC’s screen memory scan reads the address</w:t>
-      </w:r>
-      <w:proofErr w:type="gramStart"/>
-      <w:r>
-        <w:t xml:space="preserve">. </w:t>
-      </w:r>
-      <w:proofErr w:type="gramEnd"/>
-      <w:r>
-        <w:t>These writes will appear on the next frame, which may result in display tearing.</w:t>
+      <w:r>
+        <w:t xml:space="preserve"> </w:t>
+      </w:r>
+    </w:p>
+    <w:p>
+      <w:r>
+        <w:t>Display tearing occurs when screen memory writes occur after the CRTC’s screen memory scan reads the address. These writes will appear on the next frame, which may result in display tearing.</w:t>
       </w:r>
     </w:p>
     <w:p>
@@ -4578,7 +4447,46 @@
         <w:t xml:space="preserve"> many of the game-loop iterations</w:t>
       </w:r>
       <w:r>
-        <w:t>:</w:t>
+        <w:t xml:space="preserve"> look healthy, with processing </w:t>
+      </w:r>
+      <w:r>
+        <w:t xml:space="preserve">times </w:t>
+      </w:r>
+      <w:r>
+        <w:t>taking less than 1/50</w:t>
+      </w:r>
+      <w:r>
+        <w:rPr>
+          <w:vertAlign w:val="superscript"/>
+        </w:rPr>
+        <w:t>th</w:t>
+      </w:r>
+      <w:r>
+        <w:t xml:space="preserve"> of a second, and the </w:t>
+      </w:r>
+      <w:r>
+        <w:t xml:space="preserve">corresponding display </w:t>
+      </w:r>
+      <w:r>
+        <w:t>frames neatly</w:t>
+      </w:r>
+      <w:r>
+        <w:t xml:space="preserve"> right aligned</w:t>
+      </w:r>
+      <w:r>
+        <w:t>. However</w:t>
+      </w:r>
+      <w:r>
+        <w:t>,</w:t>
+      </w:r>
+      <w:r>
+        <w:t xml:space="preserve"> you </w:t>
+      </w:r>
+      <w:r>
+        <w:t>can also see that some iterations</w:t>
+      </w:r>
+      <w:r>
+        <w:t>…</w:t>
       </w:r>
     </w:p>
     <w:p>
@@ -4608,7 +4516,13 @@
         <w:t>th</w:t>
       </w:r>
       <w:r>
-        <w:t xml:space="preserve"> of a second, and these are highlighted.</w:t>
+        <w:t xml:space="preserve"> of a second</w:t>
+      </w:r>
+      <w:r>
+        <w:t xml:space="preserve"> to process</w:t>
+      </w:r>
+      <w:r>
+        <w:t>, and these are highlighted.</w:t>
       </w:r>
     </w:p>
     <w:p>
@@ -4620,6 +4534,7 @@
         </w:numPr>
       </w:pPr>
       <w:r>
+        <w:lastRenderedPageBreak/>
         <w:t>C</w:t>
       </w:r>
       <w:r>
@@ -4644,7 +4559,6 @@
         </w:numPr>
       </w:pPr>
       <w:r>
-        <w:lastRenderedPageBreak/>
         <w:t>Are misaligned with the display frames, represented by the arrows which show the duration of the CRTC’s screen memory scan of the visible area.</w:t>
       </w:r>
     </w:p>
@@ -4659,7 +4573,13 @@
         <w:t>th</w:t>
       </w:r>
       <w:r>
-        <w:t xml:space="preserve"> of a second), and that 26.12% of iterations contained mistimes screen memory writes</w:t>
+        <w:t xml:space="preserve"> of a second), and that 26.12% of iterations contained mistime</w:t>
+      </w:r>
+      <w:r>
+        <w:t>d</w:t>
+      </w:r>
+      <w:r>
+        <w:t xml:space="preserve"> screen memory writes</w:t>
       </w:r>
       <w:r>
         <w:t>, and that overall</w:t>
@@ -4678,23 +4598,13 @@
     </w:p>
     <w:p>
       <w:r>
-        <w:t xml:space="preserve">A good approach </w:t>
-      </w:r>
-      <w:proofErr w:type="gramStart"/>
-      <w:r>
-        <w:t>is</w:t>
-      </w:r>
-      <w:proofErr w:type="gramEnd"/>
-      <w:r>
-        <w:t xml:space="preserve"> this situation is to sort the iterations by their duration and select the longest one</w:t>
-      </w:r>
-      <w:proofErr w:type="gramStart"/>
-      <w:r>
-        <w:t xml:space="preserve">. </w:t>
-      </w:r>
-      <w:proofErr w:type="gramEnd"/>
-      <w:r>
-        <w:t>This sets the analysis time range to just this iteration, as shown below.</w:t>
+        <w:t>A good approach</w:t>
+      </w:r>
+      <w:r>
+        <w:t xml:space="preserve"> to take in</w:t>
+      </w:r>
+      <w:r>
+        <w:t xml:space="preserve"> this situation is to sort the iterations by their duration and select the longest one. This sets the analysis time range to just this iteration, as shown below.</w:t>
       </w:r>
     </w:p>
     <w:p>
@@ -4810,7 +4720,7 @@
         <w:pStyle w:val="Heading2"/>
       </w:pPr>
       <w:bookmarkStart w:id="23" w:name="_Toc231889091"/>
-      <w:bookmarkStart w:id="24" w:name="_Toc231893952"/>
+      <w:bookmarkStart w:id="24" w:name="_Toc231987056"/>
       <w:r>
         <w:t>What do the display frames look like?</w:t>
       </w:r>
@@ -4819,7 +4729,13 @@
     </w:p>
     <w:p>
       <w:r>
-        <w:t>The simplest way to look at the display frames is to size the timeline panel so it</w:t>
+        <w:t xml:space="preserve">The simplest way to look at the display frames is to </w:t>
+      </w:r>
+      <w:r>
+        <w:t>re</w:t>
+      </w:r>
+      <w:r>
+        <w:t>size the timeline panel so it</w:t>
       </w:r>
       <w:r>
         <w:t>’</w:t>
@@ -4838,23 +4754,7 @@
         <w:t>Fit Display Frames</w:t>
       </w:r>
       <w:r>
-        <w:t xml:space="preserve"> toolbar button</w:t>
-      </w:r>
-      <w:proofErr w:type="gramStart"/>
-      <w:r>
-        <w:t xml:space="preserve">. </w:t>
-      </w:r>
-      <w:proofErr w:type="gramEnd"/>
-      <w:r>
-        <w:t>This tiles the display frames across the window</w:t>
-      </w:r>
-      <w:proofErr w:type="gramStart"/>
-      <w:r>
-        <w:t xml:space="preserve">. </w:t>
-      </w:r>
-      <w:proofErr w:type="gramEnd"/>
-      <w:r>
-        <w:t>One can then scroll through and examine them.</w:t>
+        <w:t xml:space="preserve"> toolbar button. This tiles the display frames across the window. One can then scroll through and examine them.</w:t>
       </w:r>
     </w:p>
     <w:p>
@@ -4918,15 +4818,7 @@
         <w:t>display frame</w:t>
       </w:r>
       <w:r>
-        <w:t xml:space="preserve"> that doesn’t look correct you can examine the code that generated it using the same techniques we used to review game-loop iterations</w:t>
-      </w:r>
-      <w:proofErr w:type="gramStart"/>
-      <w:r>
-        <w:t xml:space="preserve">. </w:t>
-      </w:r>
-      <w:proofErr w:type="gramEnd"/>
-      <w:r>
-        <w:t>You just need to find the game-loop iteration that generated the frame</w:t>
+        <w:t xml:space="preserve"> that doesn’t look correct you can examine the code that generated it using the same techniques we used to review game-loop iterations. You just need to find the game-loop iteration that generated the frame</w:t>
       </w:r>
       <w:r>
         <w:t>;</w:t>
@@ -4940,7 +4832,7 @@
         <w:pStyle w:val="Heading2"/>
       </w:pPr>
       <w:bookmarkStart w:id="25" w:name="_Toc231889092"/>
-      <w:bookmarkStart w:id="26" w:name="_Toc231893953"/>
+      <w:bookmarkStart w:id="26" w:name="_Toc231987057"/>
       <w:r>
         <w:t>How do</w:t>
       </w:r>
@@ -4978,12 +4870,134 @@
         <w:t>can</w:t>
       </w:r>
       <w:r>
-        <w:t xml:space="preserve"> also be used to analyze how a routine’s durations fluctuate over time by creating a metric which doesn’t have a threshold set, or the Perform Display Analysis checkbox selected.</w:t>
-      </w:r>
-    </w:p>
-    <w:p>
-      <w:r>
-        <w:t>For example, the following snap show</w:t>
+        <w:t xml:space="preserve"> also be used to analyze how a routine’s durations fluctuate over time by creating a metric </w:t>
+      </w:r>
+      <w:r>
+        <w:t xml:space="preserve">of </w:t>
+      </w:r>
+      <w:r>
+        <w:rPr>
+          <w:b/>
+          <w:bCs/>
+        </w:rPr>
+        <w:t>T</w:t>
+      </w:r>
+      <w:r>
+        <w:rPr>
+          <w:b/>
+          <w:bCs/>
+        </w:rPr>
+        <w:t>ype</w:t>
+      </w:r>
+      <w:r>
+        <w:rPr>
+          <w:b/>
+          <w:bCs/>
+        </w:rPr>
+        <w:t xml:space="preserve"> </w:t>
+      </w:r>
+      <w:r>
+        <w:sym w:font="Wingdings" w:char="F0E0"/>
+      </w:r>
+      <w:r>
+        <w:t xml:space="preserve"> </w:t>
+      </w:r>
+      <w:r>
+        <w:rPr>
+          <w:b/>
+          <w:bCs/>
+        </w:rPr>
+        <w:t xml:space="preserve">Routine </w:t>
+      </w:r>
+      <w:r>
+        <w:rPr>
+          <w:b/>
+          <w:bCs/>
+        </w:rPr>
+        <w:t>a</w:t>
+      </w:r>
+      <w:r>
+        <w:rPr>
+          <w:b/>
+          <w:bCs/>
+        </w:rPr>
+        <w:t>ddress</w:t>
+      </w:r>
+      <w:r>
+        <w:rPr>
+          <w:b/>
+          <w:bCs/>
+        </w:rPr>
+        <w:t>,</w:t>
+      </w:r>
+      <w:r>
+        <w:t xml:space="preserve"> </w:t>
+      </w:r>
+      <w:r>
+        <w:rPr>
+          <w:b/>
+          <w:bCs/>
+        </w:rPr>
+        <w:t>T</w:t>
+      </w:r>
+      <w:r>
+        <w:rPr>
+          <w:b/>
+          <w:bCs/>
+        </w:rPr>
+        <w:t>hreshold</w:t>
+      </w:r>
+      <w:r>
+        <w:t xml:space="preserve"> </w:t>
+      </w:r>
+      <w:r>
+        <w:sym w:font="Wingdings" w:char="F0E0"/>
+      </w:r>
+      <w:r>
+        <w:t xml:space="preserve"> </w:t>
+      </w:r>
+      <w:r>
+        <w:rPr>
+          <w:b/>
+          <w:bCs/>
+        </w:rPr>
+        <w:t>none</w:t>
+      </w:r>
+      <w:r>
+        <w:t xml:space="preserve">, </w:t>
+      </w:r>
+      <w:r>
+        <w:t xml:space="preserve">and </w:t>
+      </w:r>
+      <w:r>
+        <w:rPr>
+          <w:b/>
+          <w:bCs/>
+        </w:rPr>
+        <w:t>Perform Display Analysis</w:t>
+      </w:r>
+      <w:r>
+        <w:t xml:space="preserve"> </w:t>
+      </w:r>
+      <w:r>
+        <w:sym w:font="Wingdings" w:char="F0E0"/>
+      </w:r>
+      <w:r>
+        <w:t xml:space="preserve"> unchecked</w:t>
+      </w:r>
+      <w:r>
+        <w:t>.</w:t>
+      </w:r>
+    </w:p>
+    <w:p>
+      <w:r>
+        <w:t xml:space="preserve">For example, the following </w:t>
+      </w:r>
+      <w:r>
+        <w:t xml:space="preserve">metric </w:t>
+      </w:r>
+      <w:r>
+        <w:t>show</w:t>
       </w:r>
       <w:r>
         <w:t>s</w:t>
@@ -5031,6 +5045,59 @@
         <w:rPr>
           <w:noProof/>
         </w:rPr>
+        <w:drawing>
+          <wp:inline distT="0" distB="0" distL="0" distR="0" wp14:anchorId="62B80791" wp14:editId="4907389E">
+            <wp:extent cx="3149600" cy="2791289"/>
+            <wp:effectExtent l="38100" t="38100" r="88900" b="104775"/>
+            <wp:docPr id="40433502" name="Picture 1"/>
+            <wp:cNvGraphicFramePr>
+              <a:graphicFrameLocks xmlns:a="http://schemas.openxmlformats.org/drawingml/2006/main" noChangeAspect="1"/>
+            </wp:cNvGraphicFramePr>
+            <a:graphic xmlns:a="http://schemas.openxmlformats.org/drawingml/2006/main">
+              <a:graphicData uri="http://schemas.openxmlformats.org/drawingml/2006/picture">
+                <pic:pic xmlns:pic="http://schemas.openxmlformats.org/drawingml/2006/picture">
+                  <pic:nvPicPr>
+                    <pic:cNvPr id="40433502" name=""/>
+                    <pic:cNvPicPr/>
+                  </pic:nvPicPr>
+                  <pic:blipFill>
+                    <a:blip r:embed="rId19"/>
+                    <a:stretch>
+                      <a:fillRect/>
+                    </a:stretch>
+                  </pic:blipFill>
+                  <pic:spPr>
+                    <a:xfrm>
+                      <a:off x="0" y="0"/>
+                      <a:ext cx="3160001" cy="2800507"/>
+                    </a:xfrm>
+                    <a:prstGeom prst="rect">
+                      <a:avLst/>
+                    </a:prstGeom>
+                    <a:effectLst>
+                      <a:outerShdw blurRad="50800" dist="38100" dir="2700000" algn="tl" rotWithShape="0">
+                        <a:prstClr val="black">
+                          <a:alpha val="40000"/>
+                        </a:prstClr>
+                      </a:outerShdw>
+                    </a:effectLst>
+                  </pic:spPr>
+                </pic:pic>
+              </a:graphicData>
+            </a:graphic>
+          </wp:inline>
+        </w:drawing>
+      </w:r>
+    </w:p>
+    <w:p>
+      <w:pPr>
+        <w:jc w:val="center"/>
+      </w:pPr>
+      <w:r>
+        <w:rPr>
+          <w:noProof/>
+        </w:rPr>
+        <w:lastRenderedPageBreak/>
         <w:drawing>
           <wp:inline distT="0" distB="0" distL="0" distR="0" wp14:anchorId="6568662D" wp14:editId="120A018F">
             <wp:extent cx="5154101" cy="2755460"/>
@@ -5047,7 +5114,7 @@
                     <pic:cNvPicPr/>
                   </pic:nvPicPr>
                   <pic:blipFill>
-                    <a:blip r:embed="rId19"/>
+                    <a:blip r:embed="rId20"/>
                     <a:stretch>
                       <a:fillRect/>
                     </a:stretch>
@@ -5080,9 +5147,8 @@
         <w:pStyle w:val="Heading1"/>
       </w:pPr>
       <w:bookmarkStart w:id="27" w:name="_Toc231889093"/>
-      <w:bookmarkStart w:id="28" w:name="_Toc231893954"/>
-      <w:r>
-        <w:lastRenderedPageBreak/>
+      <w:bookmarkStart w:id="28" w:name="_Toc231987058"/>
+      <w:r>
         <w:t>More details</w:t>
       </w:r>
       <w:r>
@@ -5099,7 +5165,7 @@
         <w:pStyle w:val="Heading2"/>
       </w:pPr>
       <w:bookmarkStart w:id="29" w:name="_Toc231889094"/>
-      <w:bookmarkStart w:id="30" w:name="_Toc231893955"/>
+      <w:bookmarkStart w:id="30" w:name="_Toc231987059"/>
       <w:r>
         <w:t>The code panel</w:t>
       </w:r>
@@ -5153,7 +5219,7 @@
                     <pic:cNvPicPr/>
                   </pic:nvPicPr>
                   <pic:blipFill>
-                    <a:blip r:embed="rId20"/>
+                    <a:blip r:embed="rId21"/>
                     <a:stretch>
                       <a:fillRect/>
                     </a:stretch>
@@ -5183,6 +5249,7 @@
     </w:p>
     <w:p>
       <w:r>
+        <w:lastRenderedPageBreak/>
         <w:t>If alternative opcode sequences exist for an address, a vertical bar denotes that the code was modified, as shown above.</w:t>
       </w:r>
     </w:p>
@@ -5197,19 +5264,25 @@
         <w:t xml:space="preserve"> the most </w:t>
       </w:r>
       <w:r>
+        <w:rPr>
+          <w:b/>
+          <w:bCs/>
+        </w:rPr>
         <w:t xml:space="preserve">Total </w:t>
       </w:r>
       <w:r>
-        <w:t>CPU cycles, compared to the other instructions</w:t>
-      </w:r>
-      <w:proofErr w:type="gramStart"/>
-      <w:r>
-        <w:t>.</w:t>
+        <w:rPr>
+          <w:b/>
+          <w:bCs/>
+        </w:rPr>
+        <w:t>CPU</w:t>
+      </w:r>
+      <w:r>
+        <w:t xml:space="preserve"> cycles, compared to the other instructions.</w:t>
       </w:r>
       <w:r>
         <w:t xml:space="preserve"> </w:t>
       </w:r>
-      <w:proofErr w:type="gramEnd"/>
       <w:r>
         <w:t xml:space="preserve">The table </w:t>
       </w:r>
@@ -5292,26 +5365,10 @@
           </w:tcPr>
           <w:p>
             <w:r>
-              <w:t>Whether a JMP or branch instruction invokes a tail call</w:t>
-            </w:r>
-            <w:proofErr w:type="gramStart"/>
-            <w:r>
-              <w:t xml:space="preserve">. </w:t>
-            </w:r>
-            <w:proofErr w:type="gramEnd"/>
-            <w:r>
-              <w:t xml:space="preserve">A </w:t>
-            </w:r>
-            <w:r>
-              <w:t>tail call is a JMP or branch instruction that jumps to another routine which returns with a RTS or RTI</w:t>
-            </w:r>
-            <w:proofErr w:type="gramStart"/>
-            <w:r>
-              <w:t xml:space="preserve">. </w:t>
-            </w:r>
-            <w:proofErr w:type="gramEnd"/>
-            <w:r>
-              <w:t xml:space="preserve">For a JMP, it’s equivalent to a </w:t>
+              <w:t xml:space="preserve">Whether a JMP or branch instruction invokes a tail call. A </w:t>
+            </w:r>
+            <w:r>
+              <w:t xml:space="preserve">tail call is a JMP or branch instruction that jumps to another routine which returns with a RTS or RTI. For a JMP, it’s equivalent to a </w:t>
             </w:r>
             <w:r>
               <w:rPr>
@@ -5346,15 +5403,7 @@
               <w:t xml:space="preserve"> RTN</w:t>
             </w:r>
             <w:r>
-              <w:t>, but takes up less code bytes</w:t>
-            </w:r>
-            <w:proofErr w:type="gramStart"/>
-            <w:r>
-              <w:t xml:space="preserve">. </w:t>
-            </w:r>
-            <w:proofErr w:type="gramEnd"/>
-            <w:r>
-              <w:t>For a branch it</w:t>
+              <w:t>, but takes up less code bytes. For a branch it</w:t>
             </w:r>
             <w:r>
               <w:t>’</w:t>
@@ -5445,7 +5494,6 @@
           </w:tcPr>
           <w:p>
             <w:r>
-              <w:lastRenderedPageBreak/>
               <w:t>Self CPU</w:t>
             </w:r>
           </w:p>
@@ -5543,7 +5591,7 @@
         <w:pStyle w:val="Heading2"/>
       </w:pPr>
       <w:bookmarkStart w:id="31" w:name="_Toc231889095"/>
-      <w:bookmarkStart w:id="32" w:name="_Toc231893956"/>
+      <w:bookmarkStart w:id="32" w:name="_Toc231987060"/>
       <w:r>
         <w:t xml:space="preserve">The </w:t>
       </w:r>
@@ -5582,7 +5630,7 @@
                     <pic:cNvPicPr/>
                   </pic:nvPicPr>
                   <pic:blipFill>
-                    <a:blip r:embed="rId21"/>
+                    <a:blip r:embed="rId22"/>
                     <a:stretch>
                       <a:fillRect/>
                     </a:stretch>
@@ -5676,7 +5724,7 @@
         <w:pStyle w:val="Heading1"/>
       </w:pPr>
       <w:bookmarkStart w:id="33" w:name="_Toc231889096"/>
-      <w:bookmarkStart w:id="34" w:name="_Toc231893957"/>
+      <w:bookmarkStart w:id="34" w:name="_Toc231987061"/>
       <w:r>
         <w:lastRenderedPageBreak/>
         <w:t>Acknowledgements</w:t>
@@ -5705,15 +5753,7 @@
         <w:t> video</w:t>
       </w:r>
       <w:r>
-        <w:t xml:space="preserve"> class</w:t>
-      </w:r>
-      <w:proofErr w:type="gramStart"/>
-      <w:r>
-        <w:t xml:space="preserve">. </w:t>
-      </w:r>
-      <w:proofErr w:type="gramEnd"/>
-      <w:r>
-        <w:t>Many thanks to the </w:t>
+        <w:t xml:space="preserve"> class. Many thanks to the </w:t>
       </w:r>
       <w:r>
         <w:rPr>
@@ -5805,13 +5845,8 @@
         </w:rPr>
         <w:t>MOS Reassembly for the BBC Micro</w:t>
       </w:r>
-      <w:proofErr w:type="gramStart"/>
-      <w:r>
-        <w:t xml:space="preserve">. </w:t>
-      </w:r>
-      <w:proofErr w:type="gramEnd"/>
-      <w:r>
-        <w:t xml:space="preserve">Thank you Toby for </w:t>
+      <w:r>
+        <w:t xml:space="preserve">. Thank you Toby for </w:t>
       </w:r>
       <w:r>
         <w:t xml:space="preserve">creating and maintaining </w:t>
@@ -5848,16 +5883,11 @@
       <w:r>
         <w:t xml:space="preserve"> initial version</w:t>
       </w:r>
-      <w:proofErr w:type="gramStart"/>
       <w:r>
         <w:t>.</w:t>
       </w:r>
       <w:r>
-        <w:t xml:space="preserve"> </w:t>
-      </w:r>
-      <w:proofErr w:type="gramEnd"/>
-      <w:r>
-        <w:t>Much appreciated.</w:t>
+        <w:t xml:space="preserve"> Much appreciated.</w:t>
       </w:r>
     </w:p>
     <w:p/>

</xml_diff>

<commit_message>
Updated help and corrected typo
</commit_message>
<xml_diff>
--- a/docs/Help.docx
+++ b/docs/Help.docx
@@ -125,7 +125,7 @@
           <w:r>
             <w:fldChar w:fldCharType="separate"/>
           </w:r>
-          <w:hyperlink w:anchor="_Toc232022275" w:history="1">
+          <w:hyperlink w:anchor="_Toc232075352" w:history="1">
             <w:r>
               <w:rPr>
                 <w:rStyle w:val="Hyperlink"/>
@@ -152,7 +152,7 @@
                 <w:noProof/>
                 <w:webHidden/>
               </w:rPr>
-              <w:instrText xml:space="preserve"> PAGEREF _Toc232022275 \h </w:instrText>
+              <w:instrText xml:space="preserve"> PAGEREF _Toc232075352 \h </w:instrText>
             </w:r>
             <w:r>
               <w:rPr>
@@ -195,7 +195,7 @@
               <w14:ligatures w14:val="standardContextual"/>
             </w:rPr>
           </w:pPr>
-          <w:hyperlink w:anchor="_Toc232022276" w:history="1">
+          <w:hyperlink w:anchor="_Toc232075353" w:history="1">
             <w:r>
               <w:rPr>
                 <w:rStyle w:val="Hyperlink"/>
@@ -222,7 +222,7 @@
                 <w:noProof/>
                 <w:webHidden/>
               </w:rPr>
-              <w:instrText xml:space="preserve"> PAGEREF _Toc232022276 \h </w:instrText>
+              <w:instrText xml:space="preserve"> PAGEREF _Toc232075353 \h </w:instrText>
             </w:r>
             <w:r>
               <w:rPr>
@@ -265,7 +265,7 @@
               <w14:ligatures w14:val="standardContextual"/>
             </w:rPr>
           </w:pPr>
-          <w:hyperlink w:anchor="_Toc232022277" w:history="1">
+          <w:hyperlink w:anchor="_Toc232075354" w:history="1">
             <w:r>
               <w:rPr>
                 <w:rStyle w:val="Hyperlink"/>
@@ -292,7 +292,7 @@
                 <w:noProof/>
                 <w:webHidden/>
               </w:rPr>
-              <w:instrText xml:space="preserve"> PAGEREF _Toc232022277 \h </w:instrText>
+              <w:instrText xml:space="preserve"> PAGEREF _Toc232075354 \h </w:instrText>
             </w:r>
             <w:r>
               <w:rPr>
@@ -335,7 +335,7 @@
               <w14:ligatures w14:val="standardContextual"/>
             </w:rPr>
           </w:pPr>
-          <w:hyperlink w:anchor="_Toc232022278" w:history="1">
+          <w:hyperlink w:anchor="_Toc232075355" w:history="1">
             <w:r>
               <w:rPr>
                 <w:rStyle w:val="Hyperlink"/>
@@ -362,7 +362,7 @@
                 <w:noProof/>
                 <w:webHidden/>
               </w:rPr>
-              <w:instrText xml:space="preserve"> PAGEREF _Toc232022278 \h </w:instrText>
+              <w:instrText xml:space="preserve"> PAGEREF _Toc232075355 \h </w:instrText>
             </w:r>
             <w:r>
               <w:rPr>
@@ -405,7 +405,7 @@
               <w14:ligatures w14:val="standardContextual"/>
             </w:rPr>
           </w:pPr>
-          <w:hyperlink w:anchor="_Toc232022279" w:history="1">
+          <w:hyperlink w:anchor="_Toc232075356" w:history="1">
             <w:r>
               <w:rPr>
                 <w:rStyle w:val="Hyperlink"/>
@@ -432,7 +432,7 @@
                 <w:noProof/>
                 <w:webHidden/>
               </w:rPr>
-              <w:instrText xml:space="preserve"> PAGEREF _Toc232022279 \h </w:instrText>
+              <w:instrText xml:space="preserve"> PAGEREF _Toc232075356 \h </w:instrText>
             </w:r>
             <w:r>
               <w:rPr>
@@ -475,7 +475,7 @@
               <w14:ligatures w14:val="standardContextual"/>
             </w:rPr>
           </w:pPr>
-          <w:hyperlink w:anchor="_Toc232022280" w:history="1">
+          <w:hyperlink w:anchor="_Toc232075357" w:history="1">
             <w:r>
               <w:rPr>
                 <w:rStyle w:val="Hyperlink"/>
@@ -502,7 +502,7 @@
                 <w:noProof/>
                 <w:webHidden/>
               </w:rPr>
-              <w:instrText xml:space="preserve"> PAGEREF _Toc232022280 \h </w:instrText>
+              <w:instrText xml:space="preserve"> PAGEREF _Toc232075357 \h </w:instrText>
             </w:r>
             <w:r>
               <w:rPr>
@@ -545,7 +545,7 @@
               <w14:ligatures w14:val="standardContextual"/>
             </w:rPr>
           </w:pPr>
-          <w:hyperlink w:anchor="_Toc232022281" w:history="1">
+          <w:hyperlink w:anchor="_Toc232075358" w:history="1">
             <w:r>
               <w:rPr>
                 <w:rStyle w:val="Hyperlink"/>
@@ -572,7 +572,7 @@
                 <w:noProof/>
                 <w:webHidden/>
               </w:rPr>
-              <w:instrText xml:space="preserve"> PAGEREF _Toc232022281 \h </w:instrText>
+              <w:instrText xml:space="preserve"> PAGEREF _Toc232075358 \h </w:instrText>
             </w:r>
             <w:r>
               <w:rPr>
@@ -615,7 +615,7 @@
               <w14:ligatures w14:val="standardContextual"/>
             </w:rPr>
           </w:pPr>
-          <w:hyperlink w:anchor="_Toc232022282" w:history="1">
+          <w:hyperlink w:anchor="_Toc232075359" w:history="1">
             <w:r>
               <w:rPr>
                 <w:rStyle w:val="Hyperlink"/>
@@ -642,7 +642,7 @@
                 <w:noProof/>
                 <w:webHidden/>
               </w:rPr>
-              <w:instrText xml:space="preserve"> PAGEREF _Toc232022282 \h </w:instrText>
+              <w:instrText xml:space="preserve"> PAGEREF _Toc232075359 \h </w:instrText>
             </w:r>
             <w:r>
               <w:rPr>
@@ -685,7 +685,7 @@
               <w14:ligatures w14:val="standardContextual"/>
             </w:rPr>
           </w:pPr>
-          <w:hyperlink w:anchor="_Toc232022283" w:history="1">
+          <w:hyperlink w:anchor="_Toc232075360" w:history="1">
             <w:r>
               <w:rPr>
                 <w:rStyle w:val="Hyperlink"/>
@@ -712,7 +712,7 @@
                 <w:noProof/>
                 <w:webHidden/>
               </w:rPr>
-              <w:instrText xml:space="preserve"> PAGEREF _Toc232022283 \h </w:instrText>
+              <w:instrText xml:space="preserve"> PAGEREF _Toc232075360 \h </w:instrText>
             </w:r>
             <w:r>
               <w:rPr>
@@ -755,7 +755,7 @@
               <w14:ligatures w14:val="standardContextual"/>
             </w:rPr>
           </w:pPr>
-          <w:hyperlink w:anchor="_Toc232022284" w:history="1">
+          <w:hyperlink w:anchor="_Toc232075361" w:history="1">
             <w:r>
               <w:rPr>
                 <w:rStyle w:val="Hyperlink"/>
@@ -782,7 +782,7 @@
                 <w:noProof/>
                 <w:webHidden/>
               </w:rPr>
-              <w:instrText xml:space="preserve"> PAGEREF _Toc232022284 \h </w:instrText>
+              <w:instrText xml:space="preserve"> PAGEREF _Toc232075361 \h </w:instrText>
             </w:r>
             <w:r>
               <w:rPr>
@@ -825,7 +825,7 @@
               <w14:ligatures w14:val="standardContextual"/>
             </w:rPr>
           </w:pPr>
-          <w:hyperlink w:anchor="_Toc232022285" w:history="1">
+          <w:hyperlink w:anchor="_Toc232075362" w:history="1">
             <w:r>
               <w:rPr>
                 <w:rStyle w:val="Hyperlink"/>
@@ -852,7 +852,7 @@
                 <w:noProof/>
                 <w:webHidden/>
               </w:rPr>
-              <w:instrText xml:space="preserve"> PAGEREF _Toc232022285 \h </w:instrText>
+              <w:instrText xml:space="preserve"> PAGEREF _Toc232075362 \h </w:instrText>
             </w:r>
             <w:r>
               <w:rPr>
@@ -895,7 +895,7 @@
               <w14:ligatures w14:val="standardContextual"/>
             </w:rPr>
           </w:pPr>
-          <w:hyperlink w:anchor="_Toc232022286" w:history="1">
+          <w:hyperlink w:anchor="_Toc232075363" w:history="1">
             <w:r>
               <w:rPr>
                 <w:rStyle w:val="Hyperlink"/>
@@ -922,7 +922,7 @@
                 <w:noProof/>
                 <w:webHidden/>
               </w:rPr>
-              <w:instrText xml:space="preserve"> PAGEREF _Toc232022286 \h </w:instrText>
+              <w:instrText xml:space="preserve"> PAGEREF _Toc232075363 \h </w:instrText>
             </w:r>
             <w:r>
               <w:rPr>
@@ -965,7 +965,7 @@
               <w14:ligatures w14:val="standardContextual"/>
             </w:rPr>
           </w:pPr>
-          <w:hyperlink w:anchor="_Toc232022287" w:history="1">
+          <w:hyperlink w:anchor="_Toc232075364" w:history="1">
             <w:r>
               <w:rPr>
                 <w:rStyle w:val="Hyperlink"/>
@@ -992,7 +992,7 @@
                 <w:noProof/>
                 <w:webHidden/>
               </w:rPr>
-              <w:instrText xml:space="preserve"> PAGEREF _Toc232022287 \h </w:instrText>
+              <w:instrText xml:space="preserve"> PAGEREF _Toc232075364 \h </w:instrText>
             </w:r>
             <w:r>
               <w:rPr>
@@ -1035,7 +1035,7 @@
               <w14:ligatures w14:val="standardContextual"/>
             </w:rPr>
           </w:pPr>
-          <w:hyperlink w:anchor="_Toc232022288" w:history="1">
+          <w:hyperlink w:anchor="_Toc232075365" w:history="1">
             <w:r>
               <w:rPr>
                 <w:rStyle w:val="Hyperlink"/>
@@ -1062,7 +1062,7 @@
                 <w:noProof/>
                 <w:webHidden/>
               </w:rPr>
-              <w:instrText xml:space="preserve"> PAGEREF _Toc232022288 \h </w:instrText>
+              <w:instrText xml:space="preserve"> PAGEREF _Toc232075365 \h </w:instrText>
             </w:r>
             <w:r>
               <w:rPr>
@@ -1105,7 +1105,7 @@
               <w14:ligatures w14:val="standardContextual"/>
             </w:rPr>
           </w:pPr>
-          <w:hyperlink w:anchor="_Toc232022289" w:history="1">
+          <w:hyperlink w:anchor="_Toc232075366" w:history="1">
             <w:r>
               <w:rPr>
                 <w:rStyle w:val="Hyperlink"/>
@@ -1132,7 +1132,7 @@
                 <w:noProof/>
                 <w:webHidden/>
               </w:rPr>
-              <w:instrText xml:space="preserve"> PAGEREF _Toc232022289 \h </w:instrText>
+              <w:instrText xml:space="preserve"> PAGEREF _Toc232075366 \h </w:instrText>
             </w:r>
             <w:r>
               <w:rPr>
@@ -1175,7 +1175,7 @@
               <w14:ligatures w14:val="standardContextual"/>
             </w:rPr>
           </w:pPr>
-          <w:hyperlink w:anchor="_Toc232022290" w:history="1">
+          <w:hyperlink w:anchor="_Toc232075367" w:history="1">
             <w:r>
               <w:rPr>
                 <w:rStyle w:val="Hyperlink"/>
@@ -1202,7 +1202,7 @@
                 <w:noProof/>
                 <w:webHidden/>
               </w:rPr>
-              <w:instrText xml:space="preserve"> PAGEREF _Toc232022290 \h </w:instrText>
+              <w:instrText xml:space="preserve"> PAGEREF _Toc232075367 \h </w:instrText>
             </w:r>
             <w:r>
               <w:rPr>
@@ -1245,7 +1245,7 @@
               <w14:ligatures w14:val="standardContextual"/>
             </w:rPr>
           </w:pPr>
-          <w:hyperlink w:anchor="_Toc232022291" w:history="1">
+          <w:hyperlink w:anchor="_Toc232075368" w:history="1">
             <w:r>
               <w:rPr>
                 <w:rStyle w:val="Hyperlink"/>
@@ -1272,7 +1272,7 @@
                 <w:noProof/>
                 <w:webHidden/>
               </w:rPr>
-              <w:instrText xml:space="preserve"> PAGEREF _Toc232022291 \h </w:instrText>
+              <w:instrText xml:space="preserve"> PAGEREF _Toc232075368 \h </w:instrText>
             </w:r>
             <w:r>
               <w:rPr>
@@ -1315,7 +1315,7 @@
               <w14:ligatures w14:val="standardContextual"/>
             </w:rPr>
           </w:pPr>
-          <w:hyperlink w:anchor="_Toc232022292" w:history="1">
+          <w:hyperlink w:anchor="_Toc232075369" w:history="1">
             <w:r>
               <w:rPr>
                 <w:rStyle w:val="Hyperlink"/>
@@ -1342,7 +1342,7 @@
                 <w:noProof/>
                 <w:webHidden/>
               </w:rPr>
-              <w:instrText xml:space="preserve"> PAGEREF _Toc232022292 \h </w:instrText>
+              <w:instrText xml:space="preserve"> PAGEREF _Toc232075369 \h </w:instrText>
             </w:r>
             <w:r>
               <w:rPr>
@@ -1385,7 +1385,7 @@
               <w14:ligatures w14:val="standardContextual"/>
             </w:rPr>
           </w:pPr>
-          <w:hyperlink w:anchor="_Toc232022293" w:history="1">
+          <w:hyperlink w:anchor="_Toc232075370" w:history="1">
             <w:r>
               <w:rPr>
                 <w:rStyle w:val="Hyperlink"/>
@@ -1412,7 +1412,7 @@
                 <w:noProof/>
                 <w:webHidden/>
               </w:rPr>
-              <w:instrText xml:space="preserve"> PAGEREF _Toc232022293 \h </w:instrText>
+              <w:instrText xml:space="preserve"> PAGEREF _Toc232075370 \h </w:instrText>
             </w:r>
             <w:r>
               <w:rPr>
@@ -1464,7 +1464,7 @@
       <w:pPr>
         <w:pStyle w:val="Heading1"/>
       </w:pPr>
-      <w:bookmarkStart w:id="0" w:name="_Toc232022275"/>
+      <w:bookmarkStart w:id="0" w:name="_Toc232075352"/>
       <w:proofErr w:type="spellStart"/>
       <w:r>
         <w:lastRenderedPageBreak/>
@@ -1961,7 +1961,7 @@
         <w:pStyle w:val="Heading1"/>
       </w:pPr>
       <w:bookmarkStart w:id="1" w:name="_Toc231889080"/>
-      <w:bookmarkStart w:id="2" w:name="_Toc232022276"/>
+      <w:bookmarkStart w:id="2" w:name="_Toc232075353"/>
       <w:r>
         <w:t>Getting started</w:t>
       </w:r>
@@ -2080,7 +2080,7 @@
         <w:pStyle w:val="Heading2"/>
       </w:pPr>
       <w:bookmarkStart w:id="3" w:name="_Toc231889081"/>
-      <w:bookmarkStart w:id="4" w:name="_Toc232022277"/>
+      <w:bookmarkStart w:id="4" w:name="_Toc232075354"/>
       <w:r>
         <w:lastRenderedPageBreak/>
         <w:t>The t</w:t>
@@ -2099,14 +2099,11 @@
         <w:jc w:val="center"/>
       </w:pPr>
       <w:r>
-        <w:rPr>
-          <w:noProof/>
-        </w:rPr>
         <w:drawing>
-          <wp:inline distT="0" distB="0" distL="0" distR="0" wp14:anchorId="7E83E026" wp14:editId="4E200265">
-            <wp:extent cx="6081233" cy="402167"/>
-            <wp:effectExtent l="0" t="0" r="0" b="0"/>
-            <wp:docPr id="1870340626" name="Picture 1"/>
+          <wp:inline distT="0" distB="0" distL="0" distR="0" wp14:anchorId="6533C278" wp14:editId="546B2DE6">
+            <wp:extent cx="5935133" cy="297856"/>
+            <wp:effectExtent l="38100" t="38100" r="104140" b="102235"/>
+            <wp:docPr id="1090973540" name="Picture 1"/>
             <wp:cNvGraphicFramePr>
               <a:graphicFrameLocks xmlns:a="http://schemas.openxmlformats.org/drawingml/2006/main" noChangeAspect="1"/>
             </wp:cNvGraphicFramePr>
@@ -2114,7 +2111,7 @@
               <a:graphicData uri="http://schemas.openxmlformats.org/drawingml/2006/picture">
                 <pic:pic xmlns:pic="http://schemas.openxmlformats.org/drawingml/2006/picture">
                   <pic:nvPicPr>
-                    <pic:cNvPr id="1870340626" name="Picture 1870340626"/>
+                    <pic:cNvPr id="1090973540" name=""/>
                     <pic:cNvPicPr/>
                   </pic:nvPicPr>
                   <pic:blipFill>
@@ -2126,11 +2123,18 @@
                   <pic:spPr>
                     <a:xfrm>
                       <a:off x="0" y="0"/>
-                      <a:ext cx="6142551" cy="406222"/>
+                      <a:ext cx="6127328" cy="307501"/>
                     </a:xfrm>
                     <a:prstGeom prst="rect">
                       <a:avLst/>
                     </a:prstGeom>
+                    <a:effectLst>
+                      <a:outerShdw blurRad="50800" dist="38100" dir="2700000" algn="tl" rotWithShape="0">
+                        <a:prstClr val="black">
+                          <a:alpha val="40000"/>
+                        </a:prstClr>
+                      </a:outerShdw>
+                    </a:effectLst>
                   </pic:spPr>
                 </pic:pic>
               </a:graphicData>
@@ -2161,7 +2165,7 @@
         <w:pStyle w:val="Heading2"/>
       </w:pPr>
       <w:bookmarkStart w:id="5" w:name="_Toc231889082"/>
-      <w:bookmarkStart w:id="6" w:name="_Toc232022278"/>
+      <w:bookmarkStart w:id="6" w:name="_Toc232075355"/>
       <w:r>
         <w:t>The timeline</w:t>
       </w:r>
@@ -2347,7 +2351,7 @@
         <w:pStyle w:val="Heading2"/>
       </w:pPr>
       <w:bookmarkStart w:id="7" w:name="_Toc231889083"/>
-      <w:bookmarkStart w:id="8" w:name="_Toc232022279"/>
+      <w:bookmarkStart w:id="8" w:name="_Toc232075356"/>
       <w:r>
         <w:t>The tabs…</w:t>
       </w:r>
@@ -2439,7 +2443,7 @@
         <w:pStyle w:val="Heading3"/>
       </w:pPr>
       <w:bookmarkStart w:id="9" w:name="_Toc231889084"/>
-      <w:bookmarkStart w:id="10" w:name="_Toc232022280"/>
+      <w:bookmarkStart w:id="10" w:name="_Toc232075357"/>
       <w:r>
         <w:t xml:space="preserve">Common </w:t>
       </w:r>
@@ -2859,7 +2863,7 @@
         <w:pStyle w:val="Heading2"/>
       </w:pPr>
       <w:bookmarkStart w:id="11" w:name="_Toc231889085"/>
-      <w:bookmarkStart w:id="12" w:name="_Toc232022281"/>
+      <w:bookmarkStart w:id="12" w:name="_Toc232075358"/>
       <w:r>
         <w:t>The code</w:t>
       </w:r>
@@ -2943,7 +2947,7 @@
         <w:pStyle w:val="Heading2"/>
       </w:pPr>
       <w:bookmarkStart w:id="13" w:name="_Toc231889086"/>
-      <w:bookmarkStart w:id="14" w:name="_Toc232022282"/>
+      <w:bookmarkStart w:id="14" w:name="_Toc232075359"/>
       <w:r>
         <w:t>Labels…</w:t>
       </w:r>
@@ -3295,7 +3299,7 @@
         <w:pStyle w:val="Heading1"/>
       </w:pPr>
       <w:bookmarkStart w:id="15" w:name="_Toc231889087"/>
-      <w:bookmarkStart w:id="16" w:name="_Toc232022283"/>
+      <w:bookmarkStart w:id="16" w:name="_Toc232075360"/>
       <w:r>
         <w:t>Investigations</w:t>
       </w:r>
@@ -3310,7 +3314,7 @@
         <w:pStyle w:val="Heading2"/>
       </w:pPr>
       <w:bookmarkStart w:id="17" w:name="_Toc231889088"/>
-      <w:bookmarkStart w:id="18" w:name="_Toc232022284"/>
+      <w:bookmarkStart w:id="18" w:name="_Toc232075361"/>
       <w:r>
         <w:t xml:space="preserve">Where </w:t>
       </w:r>
@@ -3916,7 +3920,7 @@
         <w:pStyle w:val="Heading2"/>
       </w:pPr>
       <w:bookmarkStart w:id="19" w:name="_Toc231889089"/>
-      <w:bookmarkStart w:id="20" w:name="_Toc232022285"/>
+      <w:bookmarkStart w:id="20" w:name="_Toc232075362"/>
       <w:r>
         <w:t>W</w:t>
       </w:r>
@@ -4115,7 +4119,7 @@
         <w:pStyle w:val="Heading2"/>
       </w:pPr>
       <w:bookmarkStart w:id="21" w:name="_Toc231889090"/>
-      <w:bookmarkStart w:id="22" w:name="_Toc232022286"/>
+      <w:bookmarkStart w:id="22" w:name="_Toc232075363"/>
       <w:r>
         <w:t>How is the game-loop behaving?</w:t>
       </w:r>
@@ -4476,14 +4480,11 @@
         <w:jc w:val="center"/>
       </w:pPr>
       <w:r>
-        <w:rPr>
-          <w:noProof/>
-        </w:rPr>
         <w:drawing>
-          <wp:inline distT="0" distB="0" distL="0" distR="0" wp14:anchorId="19E5F3FC" wp14:editId="30AE2E47">
-            <wp:extent cx="5943600" cy="2015490"/>
-            <wp:effectExtent l="38100" t="38100" r="95250" b="99060"/>
-            <wp:docPr id="1229623935" name="Picture 1"/>
+          <wp:inline distT="0" distB="0" distL="0" distR="0" wp14:anchorId="57D32363" wp14:editId="582E86B3">
+            <wp:extent cx="6328833" cy="2001786"/>
+            <wp:effectExtent l="38100" t="38100" r="91440" b="93980"/>
+            <wp:docPr id="1676761975" name="Picture 1"/>
             <wp:cNvGraphicFramePr>
               <a:graphicFrameLocks xmlns:a="http://schemas.openxmlformats.org/drawingml/2006/main" noChangeAspect="1"/>
             </wp:cNvGraphicFramePr>
@@ -4491,7 +4492,7 @@
               <a:graphicData uri="http://schemas.openxmlformats.org/drawingml/2006/picture">
                 <pic:pic xmlns:pic="http://schemas.openxmlformats.org/drawingml/2006/picture">
                   <pic:nvPicPr>
-                    <pic:cNvPr id="1229623935" name=""/>
+                    <pic:cNvPr id="1676761975" name=""/>
                     <pic:cNvPicPr/>
                   </pic:nvPicPr>
                   <pic:blipFill>
@@ -4503,7 +4504,7 @@
                   <pic:spPr>
                     <a:xfrm>
                       <a:off x="0" y="0"/>
-                      <a:ext cx="5943600" cy="2015490"/>
+                      <a:ext cx="6347413" cy="2007663"/>
                     </a:xfrm>
                     <a:prstGeom prst="rect">
                       <a:avLst/>
@@ -4726,14 +4727,11 @@
         <w:jc w:val="center"/>
       </w:pPr>
       <w:r>
-        <w:rPr>
-          <w:noProof/>
-        </w:rPr>
         <w:drawing>
-          <wp:inline distT="0" distB="0" distL="0" distR="0" wp14:anchorId="13A234F2" wp14:editId="1F8E9FBA">
-            <wp:extent cx="5943600" cy="3016885"/>
-            <wp:effectExtent l="38100" t="38100" r="95250" b="88265"/>
-            <wp:docPr id="1171638061" name="Picture 1"/>
+          <wp:inline distT="0" distB="0" distL="0" distR="0" wp14:anchorId="22FFF25C" wp14:editId="5528BE30">
+            <wp:extent cx="6096000" cy="3031066"/>
+            <wp:effectExtent l="38100" t="38100" r="95250" b="93345"/>
+            <wp:docPr id="54774119" name="Picture 1"/>
             <wp:cNvGraphicFramePr>
               <a:graphicFrameLocks xmlns:a="http://schemas.openxmlformats.org/drawingml/2006/main" noChangeAspect="1"/>
             </wp:cNvGraphicFramePr>
@@ -4741,7 +4739,7 @@
               <a:graphicData uri="http://schemas.openxmlformats.org/drawingml/2006/picture">
                 <pic:pic xmlns:pic="http://schemas.openxmlformats.org/drawingml/2006/picture">
                   <pic:nvPicPr>
-                    <pic:cNvPr id="1171638061" name=""/>
+                    <pic:cNvPr id="54774119" name=""/>
                     <pic:cNvPicPr/>
                   </pic:nvPicPr>
                   <pic:blipFill>
@@ -4753,7 +4751,7 @@
                   <pic:spPr>
                     <a:xfrm>
                       <a:off x="0" y="0"/>
-                      <a:ext cx="5943600" cy="3016885"/>
+                      <a:ext cx="6128445" cy="3047198"/>
                     </a:xfrm>
                     <a:prstGeom prst="rect">
                       <a:avLst/>
@@ -4834,7 +4832,7 @@
         <w:pStyle w:val="Heading2"/>
       </w:pPr>
       <w:bookmarkStart w:id="23" w:name="_Toc231889091"/>
-      <w:bookmarkStart w:id="24" w:name="_Toc232022287"/>
+      <w:bookmarkStart w:id="24" w:name="_Toc232075364"/>
       <w:r>
         <w:t>What do the display frames look like?</w:t>
       </w:r>
@@ -4876,15 +4874,12 @@
         <w:jc w:val="center"/>
       </w:pPr>
       <w:r>
-        <w:rPr>
-          <w:noProof/>
-        </w:rPr>
         <w:lastRenderedPageBreak/>
         <w:drawing>
-          <wp:inline distT="0" distB="0" distL="0" distR="0" wp14:anchorId="510ADEA4" wp14:editId="4D95A2D6">
-            <wp:extent cx="5132502" cy="3210008"/>
-            <wp:effectExtent l="38100" t="38100" r="87630" b="85725"/>
-            <wp:docPr id="1435873145" name="Picture 1"/>
+          <wp:inline distT="0" distB="0" distL="0" distR="0" wp14:anchorId="1373B40F" wp14:editId="068070F0">
+            <wp:extent cx="5228167" cy="3216775"/>
+            <wp:effectExtent l="38100" t="38100" r="86995" b="98425"/>
+            <wp:docPr id="1923050292" name="Picture 1"/>
             <wp:cNvGraphicFramePr>
               <a:graphicFrameLocks xmlns:a="http://schemas.openxmlformats.org/drawingml/2006/main" noChangeAspect="1"/>
             </wp:cNvGraphicFramePr>
@@ -4892,7 +4887,7 @@
               <a:graphicData uri="http://schemas.openxmlformats.org/drawingml/2006/picture">
                 <pic:pic xmlns:pic="http://schemas.openxmlformats.org/drawingml/2006/picture">
                   <pic:nvPicPr>
-                    <pic:cNvPr id="1435873145" name=""/>
+                    <pic:cNvPr id="1923050292" name=""/>
                     <pic:cNvPicPr/>
                   </pic:nvPicPr>
                   <pic:blipFill>
@@ -4904,7 +4899,7 @@
                   <pic:spPr>
                     <a:xfrm>
                       <a:off x="0" y="0"/>
-                      <a:ext cx="5194583" cy="3248835"/>
+                      <a:ext cx="5244730" cy="3226966"/>
                     </a:xfrm>
                     <a:prstGeom prst="rect">
                       <a:avLst/>
@@ -4946,7 +4941,7 @@
         <w:pStyle w:val="Heading2"/>
       </w:pPr>
       <w:bookmarkStart w:id="25" w:name="_Toc231889092"/>
-      <w:bookmarkStart w:id="26" w:name="_Toc232022288"/>
+      <w:bookmarkStart w:id="26" w:name="_Toc232075365"/>
       <w:r>
         <w:t>How do</w:t>
       </w:r>
@@ -5261,7 +5256,7 @@
         <w:pStyle w:val="Heading1"/>
       </w:pPr>
       <w:bookmarkStart w:id="27" w:name="_Toc231889093"/>
-      <w:bookmarkStart w:id="28" w:name="_Toc232022289"/>
+      <w:bookmarkStart w:id="28" w:name="_Toc232075366"/>
       <w:r>
         <w:t>More details</w:t>
       </w:r>
@@ -5279,7 +5274,7 @@
         <w:pStyle w:val="Heading2"/>
       </w:pPr>
       <w:bookmarkStart w:id="29" w:name="_Toc231889094"/>
-      <w:bookmarkStart w:id="30" w:name="_Toc232022290"/>
+      <w:bookmarkStart w:id="30" w:name="_Toc232075367"/>
       <w:r>
         <w:t>The code panel</w:t>
       </w:r>
@@ -5712,7 +5707,7 @@
         <w:pStyle w:val="Heading2"/>
       </w:pPr>
       <w:bookmarkStart w:id="31" w:name="_Toc231889095"/>
-      <w:bookmarkStart w:id="32" w:name="_Toc232022291"/>
+      <w:bookmarkStart w:id="32" w:name="_Toc232075368"/>
       <w:r>
         <w:t xml:space="preserve">The </w:t>
       </w:r>
@@ -5834,7 +5829,7 @@
         <w:pStyle w:val="Heading2"/>
       </w:pPr>
       <w:bookmarkStart w:id="33" w:name="_Toc232020685"/>
-      <w:bookmarkStart w:id="34" w:name="_Toc232022292"/>
+      <w:bookmarkStart w:id="34" w:name="_Toc232075369"/>
       <w:r>
         <w:lastRenderedPageBreak/>
         <w:t>The Display Settings dialog</w:t>
@@ -5847,6 +5842,9 @@
         <w:jc w:val="center"/>
       </w:pPr>
       <w:r>
+        <w:rPr>
+          <w:noProof/>
+        </w:rPr>
         <w:drawing>
           <wp:inline distT="0" distB="0" distL="0" distR="0" wp14:anchorId="71043470" wp14:editId="5932FBBF">
             <wp:extent cx="2633134" cy="4370917"/>
@@ -5919,7 +5917,7 @@
         <w:pStyle w:val="Heading1"/>
       </w:pPr>
       <w:bookmarkStart w:id="35" w:name="_Toc231889096"/>
-      <w:bookmarkStart w:id="36" w:name="_Toc232022293"/>
+      <w:bookmarkStart w:id="36" w:name="_Toc232075370"/>
       <w:r>
         <w:t>Acknowledgements</w:t>
       </w:r>
@@ -6063,10 +6061,7 @@
         <w:t xml:space="preserve"> </w:t>
       </w:r>
       <w:r>
-        <w:t xml:space="preserve">and </w:t>
-      </w:r>
-      <w:r>
-        <w:t xml:space="preserve">Mike Hayton </w:t>
+        <w:t xml:space="preserve">and Mike Hayton </w:t>
       </w:r>
       <w:r>
         <w:t>for their feedback</w:t>
@@ -7380,6 +7375,7 @@
   <w:style w:type="character" w:default="1" w:styleId="DefaultParagraphFont">
     <w:name w:val="Default Paragraph Font"/>
     <w:uiPriority w:val="1"/>
+    <w:semiHidden/>
     <w:unhideWhenUsed/>
   </w:style>
   <w:style w:type="table" w:default="1" w:styleId="TableNormal">

</xml_diff>

<commit_message>
Updated toolbar tooltips and help
</commit_message>
<xml_diff>
--- a/docs/Help.docx
+++ b/docs/Help.docx
@@ -13,8 +13,13 @@
           <w:szCs w:val="32"/>
         </w:rPr>
       </w:pPr>
-      <w:r>
-        <w:t xml:space="preserve">BeebPerf - </w:t>
+      <w:proofErr w:type="spellStart"/>
+      <w:r>
+        <w:t>BeebPerf</w:t>
+      </w:r>
+      <w:proofErr w:type="spellEnd"/>
+      <w:r>
+        <w:t xml:space="preserve"> - </w:t>
       </w:r>
       <w:r>
         <w:t>V</w:t>
@@ -1466,15 +1471,22 @@
         <w:pStyle w:val="Heading1"/>
       </w:pPr>
       <w:bookmarkStart w:id="0" w:name="_Toc232075352"/>
+      <w:proofErr w:type="spellStart"/>
       <w:r>
         <w:lastRenderedPageBreak/>
         <w:t>BeebPerf</w:t>
       </w:r>
       <w:bookmarkEnd w:id="0"/>
-    </w:p>
-    <w:p>
-      <w:r>
-        <w:t xml:space="preserve">BeebPerf </w:t>
+      <w:proofErr w:type="spellEnd"/>
+    </w:p>
+    <w:p>
+      <w:proofErr w:type="spellStart"/>
+      <w:r>
+        <w:t>BeebPerf</w:t>
+      </w:r>
+      <w:proofErr w:type="spellEnd"/>
+      <w:r>
+        <w:t xml:space="preserve"> </w:t>
       </w:r>
       <w:r>
         <w:t xml:space="preserve">is a profiling tool for the BBC Micro and Master, aimed at </w:t>
@@ -2328,10 +2340,19 @@
         <w:t>selected time range</w:t>
       </w:r>
       <w:r>
-        <w:t>, tile the display frames</w:t>
-      </w:r>
-      <w:r>
-        <w:t xml:space="preserve"> across the window</w:t>
+        <w:t xml:space="preserve">, </w:t>
+      </w:r>
+      <w:r>
+        <w:t xml:space="preserve">show </w:t>
+      </w:r>
+      <w:r>
+        <w:t>the display frames</w:t>
+      </w:r>
+      <w:r>
+        <w:t xml:space="preserve"> </w:t>
+      </w:r>
+      <w:r>
+        <w:t>side-by-side</w:t>
       </w:r>
       <w:r>
         <w:t xml:space="preserve">, </w:t>
@@ -2511,9 +2532,11 @@
             <w:tcW w:w="1975" w:type="dxa"/>
           </w:tcPr>
           <w:p>
+            <w:proofErr w:type="spellStart"/>
             <w:r>
               <w:t>Self CPU</w:t>
             </w:r>
+            <w:proofErr w:type="spellEnd"/>
           </w:p>
         </w:tc>
         <w:tc>
@@ -2656,13 +2679,13 @@
             <w:r>
               <w:t xml:space="preserve"> during the execution </w:t>
             </w:r>
-            <w:proofErr w:type="gramStart"/>
-            <w:r>
-              <w:t>f the</w:t>
-            </w:r>
-            <w:proofErr w:type="gramEnd"/>
-            <w:r>
-              <w:t xml:space="preserve"> routine.</w:t>
+            <w:proofErr w:type="spellStart"/>
+            <w:r>
+              <w:t>f</w:t>
+            </w:r>
+            <w:proofErr w:type="spellEnd"/>
+            <w:r>
+              <w:t xml:space="preserve"> the routine.</w:t>
             </w:r>
           </w:p>
           <w:p>
@@ -2749,7 +2772,6 @@
               </w:rPr>
               <w:t xml:space="preserve">JSR </w:t>
             </w:r>
-            <w:proofErr w:type="gramStart"/>
             <w:r>
               <w:rPr>
                 <w:b/>
@@ -2764,15 +2786,7 @@
                 <w:b/>
                 <w:bCs/>
               </w:rPr>
-              <w:t xml:space="preserve"> :</w:t>
-            </w:r>
-            <w:proofErr w:type="gramEnd"/>
-            <w:r>
-              <w:rPr>
-                <w:b/>
-                <w:bCs/>
-              </w:rPr>
-              <w:t xml:space="preserve"> </w:t>
+              <w:t xml:space="preserve"> : </w:t>
             </w:r>
             <w:r>
               <w:rPr>
@@ -4008,15 +4022,7 @@
     </w:p>
     <w:p>
       <w:r>
-        <w:t xml:space="preserve">Ideally, the most frequently accessed memory addresses should be </w:t>
-      </w:r>
-      <w:proofErr w:type="gramStart"/>
-      <w:r>
-        <w:t>in</w:t>
-      </w:r>
-      <w:proofErr w:type="gramEnd"/>
-      <w:r>
-        <w:t xml:space="preserve"> zero-page.</w:t>
+        <w:t>Ideally, the most frequently accessed memory addresses should be in zero-page.</w:t>
       </w:r>
     </w:p>
     <w:p>
@@ -4050,15 +4056,7 @@
         <w:t xml:space="preserve">does </w:t>
       </w:r>
       <w:r>
-        <w:t xml:space="preserve">using </w:t>
-      </w:r>
-      <w:proofErr w:type="gramStart"/>
-      <w:r>
-        <w:t>non zero</w:t>
-      </w:r>
-      <w:proofErr w:type="gramEnd"/>
-      <w:r>
-        <w:t>-page addressing modes.</w:t>
+        <w:t>using non zero-page addressing modes.</w:t>
       </w:r>
     </w:p>
     <w:p>
@@ -4066,15 +4064,7 @@
         <w:pStyle w:val="Callout"/>
       </w:pPr>
       <w:r>
-        <w:t xml:space="preserve">Look for opportunities where frequent </w:t>
-      </w:r>
-      <w:proofErr w:type="gramStart"/>
-      <w:r>
-        <w:t>non zero</w:t>
-      </w:r>
-      <w:proofErr w:type="gramEnd"/>
-      <w:r>
-        <w:t xml:space="preserve">-page memory accesses </w:t>
+        <w:t xml:space="preserve">Look for opportunities where frequent non zero-page memory accesses </w:t>
       </w:r>
       <w:r>
         <w:t xml:space="preserve">can be </w:t>
@@ -4124,26 +4114,19 @@
       <w:bookmarkEnd w:id="22"/>
     </w:p>
     <w:p>
-      <w:r>
-        <w:t xml:space="preserve">BeebPerf lacks </w:t>
-      </w:r>
-      <w:proofErr w:type="gramStart"/>
-      <w:r>
-        <w:t>the smarts</w:t>
-      </w:r>
-      <w:proofErr w:type="gramEnd"/>
-      <w:r>
-        <w:t xml:space="preserve"> to identify a game’s game-loop, but i</w:t>
+      <w:proofErr w:type="spellStart"/>
+      <w:r>
+        <w:t>BeebPerf</w:t>
+      </w:r>
+      <w:proofErr w:type="spellEnd"/>
+      <w:r>
+        <w:t xml:space="preserve"> lacks the smarts to identify a game’s game-loop, but i</w:t>
       </w:r>
       <w:r>
         <w:t>t</w:t>
       </w:r>
       <w:r>
-        <w:t xml:space="preserve"> does provide a </w:t>
-      </w:r>
-      <w:proofErr w:type="gramStart"/>
-      <w:r>
-        <w:t>feature</w:t>
+        <w:t xml:space="preserve"> does provide a feature</w:t>
       </w:r>
       <w:r>
         <w:t>,</w:t>
@@ -4151,7 +4134,6 @@
       <w:r>
         <w:t xml:space="preserve"> ‘</w:t>
       </w:r>
-      <w:proofErr w:type="gramEnd"/>
       <w:r>
         <w:rPr>
           <w:b/>
@@ -4365,8 +4347,13 @@
       <w:r>
         <w:t xml:space="preserve">game’s </w:t>
       </w:r>
-      <w:r>
-        <w:t xml:space="preserve">WaitForVSync routine returns (just after v-sync </w:t>
+      <w:proofErr w:type="spellStart"/>
+      <w:r>
+        <w:t>WaitForVSync</w:t>
+      </w:r>
+      <w:proofErr w:type="spellEnd"/>
+      <w:r>
+        <w:t xml:space="preserve"> routine returns (just after v-sync </w:t>
       </w:r>
       <w:r>
         <w:t xml:space="preserve">is signaled) </w:t>
@@ -5125,6 +5112,7 @@
       <w:r>
         <w:t xml:space="preserve"> </w:t>
       </w:r>
+      <w:proofErr w:type="spellStart"/>
       <w:r>
         <w:rPr>
           <w:b/>
@@ -5132,6 +5120,7 @@
         </w:rPr>
         <w:t>sortObjectDrawOrder</w:t>
       </w:r>
+      <w:proofErr w:type="spellEnd"/>
       <w:r>
         <w:t xml:space="preserve"> routine which is called every thirty-two frames to sort the game object</w:t>
       </w:r>
@@ -5485,7 +5474,6 @@
               </w:rPr>
               <w:t xml:space="preserve">JSR </w:t>
             </w:r>
-            <w:proofErr w:type="gramStart"/>
             <w:r>
               <w:rPr>
                 <w:b/>
@@ -5500,40 +5488,31 @@
                 <w:b/>
                 <w:bCs/>
               </w:rPr>
-              <w:t xml:space="preserve"> :</w:t>
-            </w:r>
-            <w:proofErr w:type="gramEnd"/>
+              <w:t xml:space="preserve"> : </w:t>
+            </w:r>
             <w:r>
               <w:rPr>
                 <w:b/>
                 <w:bCs/>
               </w:rPr>
-              <w:t xml:space="preserve"> </w:t>
+              <w:t>RTS</w:t>
+            </w:r>
+            <w:r>
+              <w:t>, but takes up less code bytes. For a branch it</w:t>
+            </w:r>
+            <w:r>
+              <w:t>’</w:t>
+            </w:r>
+            <w:r>
+              <w:t xml:space="preserve">s an optimized way to perform a conditional </w:t>
             </w:r>
             <w:r>
               <w:rPr>
                 <w:b/>
                 <w:bCs/>
               </w:rPr>
-              <w:t>RTS</w:t>
-            </w:r>
-            <w:r>
-              <w:t>, but takes up less code bytes. For a branch it</w:t>
-            </w:r>
-            <w:r>
-              <w:t>’</w:t>
-            </w:r>
-            <w:r>
-              <w:t xml:space="preserve">s an optimized way to perform a conditional </w:t>
-            </w:r>
-            <w:r>
-              <w:rPr>
-                <w:b/>
-                <w:bCs/>
-              </w:rPr>
               <w:t xml:space="preserve">JSR </w:t>
             </w:r>
-            <w:proofErr w:type="gramStart"/>
             <w:r>
               <w:rPr>
                 <w:b/>
@@ -5557,15 +5536,7 @@
                 <w:b/>
                 <w:bCs/>
               </w:rPr>
-              <w:t>:</w:t>
-            </w:r>
-            <w:proofErr w:type="gramEnd"/>
-            <w:r>
-              <w:rPr>
-                <w:b/>
-                <w:bCs/>
-              </w:rPr>
-              <w:t xml:space="preserve"> RTS</w:t>
+              <w:t>: RTS</w:t>
             </w:r>
           </w:p>
         </w:tc>
@@ -5608,9 +5579,11 @@
             <w:tcW w:w="1975" w:type="dxa"/>
           </w:tcPr>
           <w:p>
+            <w:proofErr w:type="spellStart"/>
             <w:r>
               <w:t>Self CPU</w:t>
             </w:r>
+            <w:proofErr w:type="spellEnd"/>
           </w:p>
         </w:tc>
         <w:tc>
@@ -5708,15 +5681,7 @@
       <w:bookmarkStart w:id="31" w:name="_Toc231889095"/>
       <w:bookmarkStart w:id="32" w:name="_Toc232075368"/>
       <w:r>
-        <w:t xml:space="preserve">The </w:t>
-      </w:r>
-      <w:proofErr w:type="gramStart"/>
-      <w:r>
-        <w:t>Caller \</w:t>
-      </w:r>
-      <w:proofErr w:type="gramEnd"/>
-      <w:r>
-        <w:t xml:space="preserve"> Callee </w:t>
+        <w:t xml:space="preserve">The Caller \ Callee </w:t>
       </w:r>
       <w:r>
         <w:t>tab</w:t>
@@ -5796,13 +5761,8 @@
     </w:p>
     <w:p>
       <w:r>
-        <w:t xml:space="preserve">It </w:t>
-      </w:r>
-      <w:proofErr w:type="gramStart"/>
-      <w:r>
-        <w:t>show</w:t>
-      </w:r>
-      <w:proofErr w:type="gramEnd"/>
+        <w:t>It show</w:t>
+      </w:r>
       <w:r>
         <w:t xml:space="preserve"> </w:t>
       </w:r>
@@ -5922,12 +5882,21 @@
       <w:r>
         <w:t>Portions of the display reconstruction code were based on </w:t>
       </w:r>
-      <w:r>
-        <w:rPr>
-          <w:b/>
-          <w:bCs/>
-        </w:rPr>
-        <w:t>BeebEm's video</w:t>
+      <w:proofErr w:type="spellStart"/>
+      <w:r>
+        <w:rPr>
+          <w:b/>
+          <w:bCs/>
+        </w:rPr>
+        <w:t>BeebEm's</w:t>
+      </w:r>
+      <w:proofErr w:type="spellEnd"/>
+      <w:r>
+        <w:rPr>
+          <w:b/>
+          <w:bCs/>
+        </w:rPr>
+        <w:t> video</w:t>
       </w:r>
       <w:r>
         <w:t xml:space="preserve"> class. Many thanks to the </w:t>
@@ -5957,6 +5926,7 @@
       <w:r>
         <w:t> files are compressed and uncompressed using the </w:t>
       </w:r>
+      <w:proofErr w:type="spellStart"/>
       <w:r>
         <w:rPr>
           <w:b/>
@@ -5964,8 +5934,13 @@
         </w:rPr>
         <w:t>ZLib</w:t>
       </w:r>
-      <w:r>
-        <w:t xml:space="preserve"> library - Many thanks to Jean-loup Gail</w:t>
+      <w:proofErr w:type="spellEnd"/>
+      <w:r>
+        <w:t xml:space="preserve"> library - Many thanks to Jean-loup </w:t>
+      </w:r>
+      <w:proofErr w:type="spellStart"/>
+      <w:r>
+        <w:t>Gail</w:t>
       </w:r>
       <w:r>
         <w:t>l</w:t>
@@ -5973,6 +5948,7 @@
       <w:r>
         <w:t>y</w:t>
       </w:r>
+      <w:proofErr w:type="spellEnd"/>
       <w:r>
         <w:t xml:space="preserve">, </w:t>
       </w:r>

</xml_diff>